<commit_message>
Finished Frequency Survey and Started Satellite Listening Plan
</commit_message>
<xml_diff>
--- a/Project_Management/Frequency_Survey.docx
+++ b/Project_Management/Frequency_Survey.docx
@@ -8152,7 +8152,7 @@
     <w:p>
       <w:r>
         <w:pict w14:anchorId="1D57ACE8">
-          <v:rect id="_x0000_i1084" style="width:0;height:1.5pt" o:hralign="center" o:hrstd="t" o:hr="t" fillcolor="#a0a0a0" stroked="f"/>
+          <v:rect id="_x0000_i1042" style="width:0;height:1.5pt" o:hralign="center" o:hrstd="t" o:hr="t" fillcolor="#a0a0a0" stroked="f"/>
         </w:pict>
       </w:r>
     </w:p>
@@ -8293,7 +8293,7 @@
       <w:r>
         <w:lastRenderedPageBreak/>
         <w:pict w14:anchorId="4790FD46">
-          <v:rect id="_x0000_i1085" style="width:0;height:1.5pt" o:hralign="center" o:hrstd="t" o:hr="t" fillcolor="#a0a0a0" stroked="f"/>
+          <v:rect id="_x0000_i1043" style="width:0;height:1.5pt" o:hralign="center" o:hrstd="t" o:hr="t" fillcolor="#a0a0a0" stroked="f"/>
         </w:pict>
       </w:r>
     </w:p>
@@ -8486,7 +8486,7 @@
     <w:p>
       <w:r>
         <w:pict w14:anchorId="20513ABA">
-          <v:rect id="_x0000_i1086" style="width:0;height:1.5pt" o:hralign="center" o:hrstd="t" o:hr="t" fillcolor="#a0a0a0" stroked="f"/>
+          <v:rect id="_x0000_i1044" style="width:0;height:1.5pt" o:hralign="center" o:hrstd="t" o:hr="t" fillcolor="#a0a0a0" stroked="f"/>
         </w:pict>
       </w:r>
     </w:p>
@@ -8786,7 +8786,7 @@
     <w:p>
       <w:r>
         <w:pict w14:anchorId="6746B24E">
-          <v:rect id="_x0000_i1087" style="width:0;height:1.5pt" o:hralign="center" o:hrstd="t" o:hr="t" fillcolor="#a0a0a0" stroked="f"/>
+          <v:rect id="_x0000_i1045" style="width:0;height:1.5pt" o:hralign="center" o:hrstd="t" o:hr="t" fillcolor="#a0a0a0" stroked="f"/>
         </w:pict>
       </w:r>
     </w:p>
@@ -8842,7 +8842,7 @@
     <w:p>
       <w:r>
         <w:pict w14:anchorId="1E335825">
-          <v:rect id="_x0000_i1088" style="width:0;height:1.5pt" o:hralign="center" o:hrstd="t" o:hr="t" fillcolor="#a0a0a0" stroked="f"/>
+          <v:rect id="_x0000_i1046" style="width:0;height:1.5pt" o:hralign="center" o:hrstd="t" o:hr="t" fillcolor="#a0a0a0" stroked="f"/>
         </w:pict>
       </w:r>
     </w:p>
@@ -9026,7 +9026,7 @@
     <w:p>
       <w:r>
         <w:pict w14:anchorId="32C935F2">
-          <v:rect id="_x0000_i1089" style="width:0;height:1.5pt" o:hralign="center" o:hrstd="t" o:hr="t" fillcolor="#a0a0a0" stroked="f"/>
+          <v:rect id="_x0000_i1047" style="width:0;height:1.5pt" o:hralign="center" o:hrstd="t" o:hr="t" fillcolor="#a0a0a0" stroked="f"/>
         </w:pict>
       </w:r>
     </w:p>
@@ -9108,7 +9108,7 @@
     <w:p>
       <w:r>
         <w:pict w14:anchorId="6C2748B9">
-          <v:rect id="_x0000_i1090" style="width:0;height:1.5pt" o:hralign="center" o:hrstd="t" o:hr="t" fillcolor="#a0a0a0" stroked="f"/>
+          <v:rect id="_x0000_i1048" style="width:0;height:1.5pt" o:hralign="center" o:hrstd="t" o:hr="t" fillcolor="#a0a0a0" stroked="f"/>
         </w:pict>
       </w:r>
     </w:p>
@@ -9500,6 +9500,657 @@
       </w:r>
     </w:p>
     <w:p/>
+    <w:p/>
+    <w:p/>
+    <w:p>
+      <w:pPr>
+        <w:rPr>
+          <w:b/>
+          <w:bCs/>
+          <w:color w:val="00B050"/>
+        </w:rPr>
+      </w:pPr>
+      <w:r>
+        <w:rPr>
+          <w:b/>
+          <w:bCs/>
+          <w:color w:val="00B050"/>
+        </w:rPr>
+        <w:t>python3 Signal_Detect.py</w:t>
+      </w:r>
+    </w:p>
+    <w:p/>
+    <w:p>
+      <w:r>
+        <w:drawing>
+          <wp:inline distT="0" distB="0" distL="0" distR="0" wp14:anchorId="31A4E86F" wp14:editId="278EA5CD">
+            <wp:extent cx="5943600" cy="2883535"/>
+            <wp:effectExtent l="0" t="0" r="0" b="0"/>
+            <wp:docPr id="1798311804" name="Picture 1" descr="A graph showing a number of data&#10;&#10;AI-generated content may be incorrect."/>
+            <wp:cNvGraphicFramePr>
+              <a:graphicFrameLocks xmlns:a="http://schemas.openxmlformats.org/drawingml/2006/main" noChangeAspect="1"/>
+            </wp:cNvGraphicFramePr>
+            <a:graphic xmlns:a="http://schemas.openxmlformats.org/drawingml/2006/main">
+              <a:graphicData uri="http://schemas.openxmlformats.org/drawingml/2006/picture">
+                <pic:pic xmlns:pic="http://schemas.openxmlformats.org/drawingml/2006/picture">
+                  <pic:nvPicPr>
+                    <pic:cNvPr id="1798311804" name="Picture 1" descr="A graph showing a number of data&#10;&#10;AI-generated content may be incorrect."/>
+                    <pic:cNvPicPr/>
+                  </pic:nvPicPr>
+                  <pic:blipFill>
+                    <a:blip r:embed="rId26"/>
+                    <a:stretch>
+                      <a:fillRect/>
+                    </a:stretch>
+                  </pic:blipFill>
+                  <pic:spPr>
+                    <a:xfrm>
+                      <a:off x="0" y="0"/>
+                      <a:ext cx="5943600" cy="2883535"/>
+                    </a:xfrm>
+                    <a:prstGeom prst="rect">
+                      <a:avLst/>
+                    </a:prstGeom>
+                  </pic:spPr>
+                </pic:pic>
+              </a:graphicData>
+            </a:graphic>
+          </wp:inline>
+        </w:drawing>
+      </w:r>
+    </w:p>
+    <w:p/>
+    <w:p/>
+    <w:p/>
+    <w:p>
+      <w:r>
+        <w:t xml:space="preserve">Excellent refinement—here’s a polished </w:t>
+      </w:r>
+      <w:r>
+        <w:rPr>
+          <w:b/>
+          <w:bCs/>
+        </w:rPr>
+        <w:t>report-style commentary</w:t>
+      </w:r>
+      <w:r>
+        <w:t xml:space="preserve"> including the status of </w:t>
+      </w:r>
+      <w:r>
+        <w:rPr>
+          <w:b/>
+          <w:bCs/>
+        </w:rPr>
+        <w:t>446.500 MHz</w:t>
+      </w:r>
+      <w:r>
+        <w:t>:</w:t>
+      </w:r>
+    </w:p>
+    <w:p>
+      <w:r>
+        <w:lastRenderedPageBreak/>
+        <w:pict w14:anchorId="02EDFF3E">
+          <v:rect id="_x0000_i1061" style="width:0;height:1.5pt" o:hralign="center" o:hrstd="t" o:hr="t" fillcolor="#a0a0a0" stroked="f"/>
+        </w:pict>
+      </w:r>
+    </w:p>
+    <w:p>
+      <w:pPr>
+        <w:rPr>
+          <w:b/>
+          <w:bCs/>
+        </w:rPr>
+      </w:pPr>
+      <w:r>
+        <w:rPr>
+          <w:rFonts w:ascii="Segoe UI Emoji" w:hAnsi="Segoe UI Emoji" w:cs="Segoe UI Emoji"/>
+          <w:b/>
+          <w:bCs/>
+        </w:rPr>
+        <w:t>📡</w:t>
+      </w:r>
+      <w:r>
+        <w:rPr>
+          <w:b/>
+          <w:bCs/>
+        </w:rPr>
+        <w:t xml:space="preserve"> Signal Cluster Analysis Report</w:t>
+      </w:r>
+    </w:p>
+    <w:p>
+      <w:r>
+        <w:rPr>
+          <w:b/>
+          <w:bCs/>
+        </w:rPr>
+        <w:t>Date:</w:t>
+      </w:r>
+      <w:r>
+        <w:t xml:space="preserve"> 2025-05-03</w:t>
+      </w:r>
+      <w:r>
+        <w:br/>
+      </w:r>
+      <w:r>
+        <w:rPr>
+          <w:b/>
+          <w:bCs/>
+        </w:rPr>
+        <w:t>Subject:</w:t>
+      </w:r>
+      <w:r>
+        <w:t xml:space="preserve"> Frequencies of Detected Signal Clusters (446 MHz Band)</w:t>
+      </w:r>
+    </w:p>
+    <w:p>
+      <w:pPr>
+        <w:rPr>
+          <w:b/>
+          <w:bCs/>
+        </w:rPr>
+      </w:pPr>
+      <w:r>
+        <w:rPr>
+          <w:b/>
+          <w:bCs/>
+        </w:rPr>
+        <w:t>Overview:</w:t>
+      </w:r>
+    </w:p>
+    <w:p>
+      <w:r>
+        <w:t>A frequency scan was conducted in the 446 MHz band to detect and categorize signal clusters based on their strength. Signals were grouped into:</w:t>
+      </w:r>
+    </w:p>
+    <w:p>
+      <w:pPr>
+        <w:numPr>
+          <w:ilvl w:val="0"/>
+          <w:numId w:val="24"/>
+        </w:numPr>
+      </w:pPr>
+      <w:r>
+        <w:rPr>
+          <w:b/>
+          <w:bCs/>
+        </w:rPr>
+        <w:t>Strong signals</w:t>
+      </w:r>
+      <w:r>
+        <w:t xml:space="preserve"> (≥ –42 dBm)</w:t>
+      </w:r>
+    </w:p>
+    <w:p>
+      <w:pPr>
+        <w:numPr>
+          <w:ilvl w:val="0"/>
+          <w:numId w:val="24"/>
+        </w:numPr>
+      </w:pPr>
+      <w:r>
+        <w:rPr>
+          <w:b/>
+          <w:bCs/>
+        </w:rPr>
+        <w:t>Weaker signals</w:t>
+      </w:r>
+      <w:r>
+        <w:t xml:space="preserve"> (–49 dBm to –44 dBm)</w:t>
+      </w:r>
+    </w:p>
+    <w:p>
+      <w:r>
+        <w:t>The figure below summarizes the frequency distribution and count of detected signal clusters.</w:t>
+      </w:r>
+    </w:p>
+    <w:p>
+      <w:pPr>
+        <w:rPr>
+          <w:b/>
+          <w:bCs/>
+        </w:rPr>
+      </w:pPr>
+      <w:r>
+        <w:rPr>
+          <w:b/>
+          <w:bCs/>
+        </w:rPr>
+        <w:t>Key Findings:</w:t>
+      </w:r>
+    </w:p>
+    <w:p>
+      <w:pPr>
+        <w:numPr>
+          <w:ilvl w:val="0"/>
+          <w:numId w:val="25"/>
+        </w:numPr>
+      </w:pPr>
+      <w:r>
+        <w:rPr>
+          <w:b/>
+          <w:bCs/>
+        </w:rPr>
+        <w:t>Strong Signal Clusters:</w:t>
+      </w:r>
+    </w:p>
+    <w:p>
+      <w:pPr>
+        <w:numPr>
+          <w:ilvl w:val="1"/>
+          <w:numId w:val="25"/>
+        </w:numPr>
+      </w:pPr>
+      <w:r>
+        <w:rPr>
+          <w:b/>
+          <w:bCs/>
+        </w:rPr>
+        <w:t>446.520 MHz:</w:t>
+      </w:r>
+      <w:r>
+        <w:t xml:space="preserve"> Dominant cluster with ~2900 detections.</w:t>
+      </w:r>
+    </w:p>
+    <w:p>
+      <w:pPr>
+        <w:numPr>
+          <w:ilvl w:val="1"/>
+          <w:numId w:val="25"/>
+        </w:numPr>
+      </w:pPr>
+      <w:r>
+        <w:rPr>
+          <w:b/>
+          <w:bCs/>
+        </w:rPr>
+        <w:t>446.525 MHz:</w:t>
+      </w:r>
+      <w:r>
+        <w:t xml:space="preserve"> Secondary cluster with ~600 detections.</w:t>
+      </w:r>
+    </w:p>
+    <w:p>
+      <w:pPr>
+        <w:numPr>
+          <w:ilvl w:val="1"/>
+          <w:numId w:val="25"/>
+        </w:numPr>
+      </w:pPr>
+      <w:r>
+        <w:rPr>
+          <w:b/>
+          <w:bCs/>
+        </w:rPr>
+        <w:t>446.530 MHz:</w:t>
+      </w:r>
+      <w:r>
+        <w:t xml:space="preserve"> Secondary cluster with ~600 detections.</w:t>
+      </w:r>
+    </w:p>
+    <w:p>
+      <w:pPr>
+        <w:numPr>
+          <w:ilvl w:val="0"/>
+          <w:numId w:val="25"/>
+        </w:numPr>
+      </w:pPr>
+      <w:r>
+        <w:rPr>
+          <w:b/>
+          <w:bCs/>
+        </w:rPr>
+        <w:t>Weaker Signal Cluster:</w:t>
+      </w:r>
+    </w:p>
+    <w:p>
+      <w:pPr>
+        <w:numPr>
+          <w:ilvl w:val="1"/>
+          <w:numId w:val="25"/>
+        </w:numPr>
+      </w:pPr>
+      <w:r>
+        <w:rPr>
+          <w:b/>
+          <w:bCs/>
+        </w:rPr>
+        <w:t>446.537 MHz:</w:t>
+      </w:r>
+      <w:r>
+        <w:t xml:space="preserve"> Significant cluster with ~2200 detections.</w:t>
+      </w:r>
+    </w:p>
+    <w:p>
+      <w:pPr>
+        <w:numPr>
+          <w:ilvl w:val="0"/>
+          <w:numId w:val="25"/>
+        </w:numPr>
+      </w:pPr>
+      <w:r>
+        <w:rPr>
+          <w:b/>
+          <w:bCs/>
+        </w:rPr>
+        <w:t>446.500 MHz Status:</w:t>
+      </w:r>
+    </w:p>
+    <w:p>
+      <w:pPr>
+        <w:numPr>
+          <w:ilvl w:val="1"/>
+          <w:numId w:val="25"/>
+        </w:numPr>
+      </w:pPr>
+      <w:r>
+        <w:rPr>
+          <w:b/>
+          <w:bCs/>
+        </w:rPr>
+        <w:t xml:space="preserve">No significant signal activity </w:t>
+      </w:r>
+      <w:proofErr w:type="gramStart"/>
+      <w:r>
+        <w:rPr>
+          <w:b/>
+          <w:bCs/>
+        </w:rPr>
+        <w:t>detected</w:t>
+      </w:r>
+      <w:proofErr w:type="gramEnd"/>
+      <w:r>
+        <w:rPr>
+          <w:b/>
+          <w:bCs/>
+        </w:rPr>
+        <w:t xml:space="preserve"> at 446.500 </w:t>
+      </w:r>
+      <w:proofErr w:type="spellStart"/>
+      <w:r>
+        <w:rPr>
+          <w:b/>
+          <w:bCs/>
+        </w:rPr>
+        <w:t>MHz.</w:t>
+      </w:r>
+      <w:proofErr w:type="spellEnd"/>
+      <w:r>
+        <w:br/>
+        <w:t>This frequency remained below detection thresholds or showed only noise-level signals during the scan window.</w:t>
+      </w:r>
+    </w:p>
+    <w:p>
+      <w:pPr>
+        <w:rPr>
+          <w:b/>
+          <w:bCs/>
+        </w:rPr>
+      </w:pPr>
+      <w:r>
+        <w:rPr>
+          <w:b/>
+          <w:bCs/>
+        </w:rPr>
+        <w:t>Interpretation:</w:t>
+      </w:r>
+    </w:p>
+    <w:p>
+      <w:pPr>
+        <w:numPr>
+          <w:ilvl w:val="0"/>
+          <w:numId w:val="26"/>
+        </w:numPr>
+      </w:pPr>
+      <w:r>
+        <w:t xml:space="preserve">The concentration of strong signals at </w:t>
+      </w:r>
+      <w:r>
+        <w:rPr>
+          <w:b/>
+          <w:bCs/>
+        </w:rPr>
+        <w:t>446.520 MHz</w:t>
+      </w:r>
+      <w:r>
+        <w:t xml:space="preserve"> indicates sustained and dominant transmissions, likely corresponding to a primary communication channel (e.g., PMR446/FRS).</w:t>
+      </w:r>
+    </w:p>
+    <w:p>
+      <w:pPr>
+        <w:numPr>
+          <w:ilvl w:val="0"/>
+          <w:numId w:val="26"/>
+        </w:numPr>
+      </w:pPr>
+      <w:r>
+        <w:t xml:space="preserve">Secondary peaks at </w:t>
+      </w:r>
+      <w:r>
+        <w:rPr>
+          <w:b/>
+          <w:bCs/>
+        </w:rPr>
+        <w:t>446.525 MHz</w:t>
+      </w:r>
+      <w:r>
+        <w:t xml:space="preserve"> and </w:t>
+      </w:r>
+      <w:r>
+        <w:rPr>
+          <w:b/>
+          <w:bCs/>
+        </w:rPr>
+        <w:t>446.530 MHz</w:t>
+      </w:r>
+      <w:r>
+        <w:t xml:space="preserve"> may represent adjacent channel usage, harmonic interference, or overlapping transmissions from different sources.</w:t>
+      </w:r>
+    </w:p>
+    <w:p>
+      <w:pPr>
+        <w:numPr>
+          <w:ilvl w:val="0"/>
+          <w:numId w:val="26"/>
+        </w:numPr>
+      </w:pPr>
+      <w:r>
+        <w:lastRenderedPageBreak/>
+        <w:t xml:space="preserve">The weaker signal cluster at </w:t>
+      </w:r>
+      <w:r>
+        <w:rPr>
+          <w:b/>
+          <w:bCs/>
+        </w:rPr>
+        <w:t>446.537 MHz</w:t>
+      </w:r>
+      <w:r>
+        <w:t xml:space="preserve"> may be due to:</w:t>
+      </w:r>
+    </w:p>
+    <w:p>
+      <w:pPr>
+        <w:numPr>
+          <w:ilvl w:val="1"/>
+          <w:numId w:val="26"/>
+        </w:numPr>
+      </w:pPr>
+      <w:r>
+        <w:t>Off-frequency or poorly calibrated transmitters</w:t>
+      </w:r>
+    </w:p>
+    <w:p>
+      <w:pPr>
+        <w:numPr>
+          <w:ilvl w:val="1"/>
+          <w:numId w:val="26"/>
+        </w:numPr>
+      </w:pPr>
+      <w:r>
+        <w:t>Reflected or refracted signals</w:t>
+      </w:r>
+    </w:p>
+    <w:p>
+      <w:pPr>
+        <w:numPr>
+          <w:ilvl w:val="1"/>
+          <w:numId w:val="26"/>
+        </w:numPr>
+      </w:pPr>
+      <w:r>
+        <w:t>Signal drift or adjacent-band leakage</w:t>
+      </w:r>
+    </w:p>
+    <w:p>
+      <w:r>
+        <w:t xml:space="preserve">The absence of significant signals at </w:t>
+      </w:r>
+      <w:r>
+        <w:rPr>
+          <w:b/>
+          <w:bCs/>
+        </w:rPr>
+        <w:t>446.500 MHz</w:t>
+      </w:r>
+      <w:r>
+        <w:t xml:space="preserve"> suggests that this frequency remains unused or inactive in the surveyed environment during the observation period.</w:t>
+      </w:r>
+    </w:p>
+    <w:p>
+      <w:pPr>
+        <w:rPr>
+          <w:b/>
+          <w:bCs/>
+        </w:rPr>
+      </w:pPr>
+      <w:r>
+        <w:rPr>
+          <w:b/>
+          <w:bCs/>
+        </w:rPr>
+        <w:t>Conclusions and Recommendations:</w:t>
+      </w:r>
+    </w:p>
+    <w:p>
+      <w:r>
+        <w:rPr>
+          <w:rFonts w:ascii="Segoe UI Emoji" w:hAnsi="Segoe UI Emoji" w:cs="Segoe UI Emoji"/>
+        </w:rPr>
+        <w:t>✅</w:t>
+      </w:r>
+      <w:r>
+        <w:t xml:space="preserve"> </w:t>
+      </w:r>
+      <w:r>
+        <w:rPr>
+          <w:b/>
+          <w:bCs/>
+        </w:rPr>
+        <w:t>446.520 MHz</w:t>
+      </w:r>
+      <w:r>
+        <w:t xml:space="preserve"> shows the highest signal activity and may experience congestion or interference.</w:t>
+      </w:r>
+    </w:p>
+    <w:p>
+      <w:r>
+        <w:rPr>
+          <w:rFonts w:ascii="Segoe UI Emoji" w:hAnsi="Segoe UI Emoji" w:cs="Segoe UI Emoji"/>
+        </w:rPr>
+        <w:t>✅</w:t>
+      </w:r>
+      <w:r>
+        <w:t xml:space="preserve"> </w:t>
+      </w:r>
+      <w:r>
+        <w:rPr>
+          <w:b/>
+          <w:bCs/>
+          <w:highlight w:val="yellow"/>
+        </w:rPr>
+        <w:t>446.500 MHz</w:t>
+      </w:r>
+      <w:r>
+        <w:rPr>
+          <w:highlight w:val="yellow"/>
+        </w:rPr>
+        <w:t xml:space="preserve"> could be considered for potential use if a clear channel is required, pending further verification.</w:t>
+      </w:r>
+    </w:p>
+    <w:p>
+      <w:r>
+        <w:rPr>
+          <w:rFonts w:ascii="Segoe UI Emoji" w:hAnsi="Segoe UI Emoji" w:cs="Segoe UI Emoji"/>
+        </w:rPr>
+        <w:t>✅</w:t>
+      </w:r>
+      <w:r>
+        <w:t xml:space="preserve"> Continued monitoring is recommended to confirm signal patterns, particularly around </w:t>
+      </w:r>
+      <w:r>
+        <w:rPr>
+          <w:b/>
+          <w:bCs/>
+        </w:rPr>
+        <w:t>446.537 MHz</w:t>
+      </w:r>
+      <w:r>
+        <w:t>, to identify potential sources of off-channel transmissions.</w:t>
+      </w:r>
+    </w:p>
+    <w:p>
+      <w:r>
+        <w:rPr>
+          <w:rFonts w:ascii="Segoe UI Emoji" w:hAnsi="Segoe UI Emoji" w:cs="Segoe UI Emoji"/>
+        </w:rPr>
+        <w:t>✅</w:t>
+      </w:r>
+      <w:r>
+        <w:t xml:space="preserve"> If interference mitigation is a priority, focus efforts on managing activity around </w:t>
+      </w:r>
+      <w:r>
+        <w:rPr>
+          <w:b/>
+          <w:bCs/>
+        </w:rPr>
+        <w:t>446.520 MHz</w:t>
+      </w:r>
+      <w:r>
+        <w:t xml:space="preserve"> and </w:t>
+      </w:r>
+      <w:r>
+        <w:rPr>
+          <w:b/>
+          <w:bCs/>
+        </w:rPr>
+        <w:t xml:space="preserve">446.537 </w:t>
+      </w:r>
+      <w:proofErr w:type="spellStart"/>
+      <w:r>
+        <w:rPr>
+          <w:b/>
+          <w:bCs/>
+        </w:rPr>
+        <w:t>MHz</w:t>
+      </w:r>
+      <w:r>
+        <w:t>.</w:t>
+      </w:r>
+      <w:proofErr w:type="spellEnd"/>
+    </w:p>
+    <w:p>
+      <w:r>
+        <w:pict w14:anchorId="7F6596F5">
+          <v:rect id="_x0000_i1062" style="width:0;height:1.5pt" o:hralign="center" o:hrstd="t" o:hr="t" fillcolor="#a0a0a0" stroked="f"/>
+        </w:pict>
+      </w:r>
+    </w:p>
+    <w:p>
+      <w:r>
+        <w:t>Would you like this formatted into a PDF, or do you want it tailored for a specific audience (e.g., technical team, stakeholders)?</w:t>
+      </w:r>
+    </w:p>
     <w:p/>
     <w:sectPr>
       <w:pgSz w:w="12240" w:h="15840"/>
@@ -9812,6 +10463,123 @@
     </w:lvl>
   </w:abstractNum>
   <w:abstractNum w:abstractNumId="2" w15:restartNumberingAfterBreak="0">
+    <w:nsid w:val="124D581A"/>
+    <w:multiLevelType w:val="multilevel"/>
+    <w:tmpl w:val="62222BA6"/>
+    <w:lvl w:ilvl="0">
+      <w:start w:val="1"/>
+      <w:numFmt w:val="decimal"/>
+      <w:lvlText w:val="%1."/>
+      <w:lvlJc w:val="left"/>
+      <w:pPr>
+        <w:tabs>
+          <w:tab w:val="num" w:pos="720"/>
+        </w:tabs>
+        <w:ind w:left="720" w:hanging="360"/>
+      </w:pPr>
+    </w:lvl>
+    <w:lvl w:ilvl="1">
+      <w:start w:val="1"/>
+      <w:numFmt w:val="bullet"/>
+      <w:lvlText w:val="o"/>
+      <w:lvlJc w:val="left"/>
+      <w:pPr>
+        <w:tabs>
+          <w:tab w:val="num" w:pos="1440"/>
+        </w:tabs>
+        <w:ind w:left="1440" w:hanging="360"/>
+      </w:pPr>
+      <w:rPr>
+        <w:rFonts w:ascii="Courier New" w:hAnsi="Courier New" w:hint="default"/>
+        <w:sz w:val="20"/>
+      </w:rPr>
+    </w:lvl>
+    <w:lvl w:ilvl="2" w:tentative="1">
+      <w:start w:val="1"/>
+      <w:numFmt w:val="decimal"/>
+      <w:lvlText w:val="%3."/>
+      <w:lvlJc w:val="left"/>
+      <w:pPr>
+        <w:tabs>
+          <w:tab w:val="num" w:pos="2160"/>
+        </w:tabs>
+        <w:ind w:left="2160" w:hanging="360"/>
+      </w:pPr>
+    </w:lvl>
+    <w:lvl w:ilvl="3" w:tentative="1">
+      <w:start w:val="1"/>
+      <w:numFmt w:val="decimal"/>
+      <w:lvlText w:val="%4."/>
+      <w:lvlJc w:val="left"/>
+      <w:pPr>
+        <w:tabs>
+          <w:tab w:val="num" w:pos="2880"/>
+        </w:tabs>
+        <w:ind w:left="2880" w:hanging="360"/>
+      </w:pPr>
+    </w:lvl>
+    <w:lvl w:ilvl="4" w:tentative="1">
+      <w:start w:val="1"/>
+      <w:numFmt w:val="decimal"/>
+      <w:lvlText w:val="%5."/>
+      <w:lvlJc w:val="left"/>
+      <w:pPr>
+        <w:tabs>
+          <w:tab w:val="num" w:pos="3600"/>
+        </w:tabs>
+        <w:ind w:left="3600" w:hanging="360"/>
+      </w:pPr>
+    </w:lvl>
+    <w:lvl w:ilvl="5" w:tentative="1">
+      <w:start w:val="1"/>
+      <w:numFmt w:val="decimal"/>
+      <w:lvlText w:val="%6."/>
+      <w:lvlJc w:val="left"/>
+      <w:pPr>
+        <w:tabs>
+          <w:tab w:val="num" w:pos="4320"/>
+        </w:tabs>
+        <w:ind w:left="4320" w:hanging="360"/>
+      </w:pPr>
+    </w:lvl>
+    <w:lvl w:ilvl="6" w:tentative="1">
+      <w:start w:val="1"/>
+      <w:numFmt w:val="decimal"/>
+      <w:lvlText w:val="%7."/>
+      <w:lvlJc w:val="left"/>
+      <w:pPr>
+        <w:tabs>
+          <w:tab w:val="num" w:pos="5040"/>
+        </w:tabs>
+        <w:ind w:left="5040" w:hanging="360"/>
+      </w:pPr>
+    </w:lvl>
+    <w:lvl w:ilvl="7" w:tentative="1">
+      <w:start w:val="1"/>
+      <w:numFmt w:val="decimal"/>
+      <w:lvlText w:val="%8."/>
+      <w:lvlJc w:val="left"/>
+      <w:pPr>
+        <w:tabs>
+          <w:tab w:val="num" w:pos="5760"/>
+        </w:tabs>
+        <w:ind w:left="5760" w:hanging="360"/>
+      </w:pPr>
+    </w:lvl>
+    <w:lvl w:ilvl="8" w:tentative="1">
+      <w:start w:val="1"/>
+      <w:numFmt w:val="decimal"/>
+      <w:lvlText w:val="%9."/>
+      <w:lvlJc w:val="left"/>
+      <w:pPr>
+        <w:tabs>
+          <w:tab w:val="num" w:pos="6480"/>
+        </w:tabs>
+        <w:ind w:left="6480" w:hanging="360"/>
+      </w:pPr>
+    </w:lvl>
+  </w:abstractNum>
+  <w:abstractNum w:abstractNumId="3" w15:restartNumberingAfterBreak="0">
     <w:nsid w:val="12B611D3"/>
     <w:multiLevelType w:val="multilevel"/>
     <w:tmpl w:val="FA760594"/>
@@ -9960,7 +10728,7 @@
       </w:rPr>
     </w:lvl>
   </w:abstractNum>
-  <w:abstractNum w:abstractNumId="3" w15:restartNumberingAfterBreak="0">
+  <w:abstractNum w:abstractNumId="4" w15:restartNumberingAfterBreak="0">
     <w:nsid w:val="1A7F3538"/>
     <w:multiLevelType w:val="multilevel"/>
     <w:tmpl w:val="B1C2CD2A"/>
@@ -10109,7 +10877,7 @@
       </w:rPr>
     </w:lvl>
   </w:abstractNum>
-  <w:abstractNum w:abstractNumId="4" w15:restartNumberingAfterBreak="0">
+  <w:abstractNum w:abstractNumId="5" w15:restartNumberingAfterBreak="0">
     <w:nsid w:val="1D0E5786"/>
     <w:multiLevelType w:val="multilevel"/>
     <w:tmpl w:val="08FCF7F2"/>
@@ -10258,7 +11026,156 @@
       </w:rPr>
     </w:lvl>
   </w:abstractNum>
-  <w:abstractNum w:abstractNumId="5" w15:restartNumberingAfterBreak="0">
+  <w:abstractNum w:abstractNumId="6" w15:restartNumberingAfterBreak="0">
+    <w:nsid w:val="28F03290"/>
+    <w:multiLevelType w:val="multilevel"/>
+    <w:tmpl w:val="EDFC8FD6"/>
+    <w:lvl w:ilvl="0">
+      <w:start w:val="1"/>
+      <w:numFmt w:val="bullet"/>
+      <w:lvlText w:val=""/>
+      <w:lvlJc w:val="left"/>
+      <w:pPr>
+        <w:tabs>
+          <w:tab w:val="num" w:pos="720"/>
+        </w:tabs>
+        <w:ind w:left="720" w:hanging="360"/>
+      </w:pPr>
+      <w:rPr>
+        <w:rFonts w:ascii="Symbol" w:hAnsi="Symbol" w:hint="default"/>
+        <w:sz w:val="20"/>
+      </w:rPr>
+    </w:lvl>
+    <w:lvl w:ilvl="1" w:tentative="1">
+      <w:start w:val="1"/>
+      <w:numFmt w:val="bullet"/>
+      <w:lvlText w:val="o"/>
+      <w:lvlJc w:val="left"/>
+      <w:pPr>
+        <w:tabs>
+          <w:tab w:val="num" w:pos="1440"/>
+        </w:tabs>
+        <w:ind w:left="1440" w:hanging="360"/>
+      </w:pPr>
+      <w:rPr>
+        <w:rFonts w:ascii="Courier New" w:hAnsi="Courier New" w:hint="default"/>
+        <w:sz w:val="20"/>
+      </w:rPr>
+    </w:lvl>
+    <w:lvl w:ilvl="2" w:tentative="1">
+      <w:start w:val="1"/>
+      <w:numFmt w:val="bullet"/>
+      <w:lvlText w:val=""/>
+      <w:lvlJc w:val="left"/>
+      <w:pPr>
+        <w:tabs>
+          <w:tab w:val="num" w:pos="2160"/>
+        </w:tabs>
+        <w:ind w:left="2160" w:hanging="360"/>
+      </w:pPr>
+      <w:rPr>
+        <w:rFonts w:ascii="Wingdings" w:hAnsi="Wingdings" w:hint="default"/>
+        <w:sz w:val="20"/>
+      </w:rPr>
+    </w:lvl>
+    <w:lvl w:ilvl="3" w:tentative="1">
+      <w:start w:val="1"/>
+      <w:numFmt w:val="bullet"/>
+      <w:lvlText w:val=""/>
+      <w:lvlJc w:val="left"/>
+      <w:pPr>
+        <w:tabs>
+          <w:tab w:val="num" w:pos="2880"/>
+        </w:tabs>
+        <w:ind w:left="2880" w:hanging="360"/>
+      </w:pPr>
+      <w:rPr>
+        <w:rFonts w:ascii="Wingdings" w:hAnsi="Wingdings" w:hint="default"/>
+        <w:sz w:val="20"/>
+      </w:rPr>
+    </w:lvl>
+    <w:lvl w:ilvl="4" w:tentative="1">
+      <w:start w:val="1"/>
+      <w:numFmt w:val="bullet"/>
+      <w:lvlText w:val=""/>
+      <w:lvlJc w:val="left"/>
+      <w:pPr>
+        <w:tabs>
+          <w:tab w:val="num" w:pos="3600"/>
+        </w:tabs>
+        <w:ind w:left="3600" w:hanging="360"/>
+      </w:pPr>
+      <w:rPr>
+        <w:rFonts w:ascii="Wingdings" w:hAnsi="Wingdings" w:hint="default"/>
+        <w:sz w:val="20"/>
+      </w:rPr>
+    </w:lvl>
+    <w:lvl w:ilvl="5" w:tentative="1">
+      <w:start w:val="1"/>
+      <w:numFmt w:val="bullet"/>
+      <w:lvlText w:val=""/>
+      <w:lvlJc w:val="left"/>
+      <w:pPr>
+        <w:tabs>
+          <w:tab w:val="num" w:pos="4320"/>
+        </w:tabs>
+        <w:ind w:left="4320" w:hanging="360"/>
+      </w:pPr>
+      <w:rPr>
+        <w:rFonts w:ascii="Wingdings" w:hAnsi="Wingdings" w:hint="default"/>
+        <w:sz w:val="20"/>
+      </w:rPr>
+    </w:lvl>
+    <w:lvl w:ilvl="6" w:tentative="1">
+      <w:start w:val="1"/>
+      <w:numFmt w:val="bullet"/>
+      <w:lvlText w:val=""/>
+      <w:lvlJc w:val="left"/>
+      <w:pPr>
+        <w:tabs>
+          <w:tab w:val="num" w:pos="5040"/>
+        </w:tabs>
+        <w:ind w:left="5040" w:hanging="360"/>
+      </w:pPr>
+      <w:rPr>
+        <w:rFonts w:ascii="Wingdings" w:hAnsi="Wingdings" w:hint="default"/>
+        <w:sz w:val="20"/>
+      </w:rPr>
+    </w:lvl>
+    <w:lvl w:ilvl="7" w:tentative="1">
+      <w:start w:val="1"/>
+      <w:numFmt w:val="bullet"/>
+      <w:lvlText w:val=""/>
+      <w:lvlJc w:val="left"/>
+      <w:pPr>
+        <w:tabs>
+          <w:tab w:val="num" w:pos="5760"/>
+        </w:tabs>
+        <w:ind w:left="5760" w:hanging="360"/>
+      </w:pPr>
+      <w:rPr>
+        <w:rFonts w:ascii="Wingdings" w:hAnsi="Wingdings" w:hint="default"/>
+        <w:sz w:val="20"/>
+      </w:rPr>
+    </w:lvl>
+    <w:lvl w:ilvl="8" w:tentative="1">
+      <w:start w:val="1"/>
+      <w:numFmt w:val="bullet"/>
+      <w:lvlText w:val=""/>
+      <w:lvlJc w:val="left"/>
+      <w:pPr>
+        <w:tabs>
+          <w:tab w:val="num" w:pos="6480"/>
+        </w:tabs>
+        <w:ind w:left="6480" w:hanging="360"/>
+      </w:pPr>
+      <w:rPr>
+        <w:rFonts w:ascii="Wingdings" w:hAnsi="Wingdings" w:hint="default"/>
+        <w:sz w:val="20"/>
+      </w:rPr>
+    </w:lvl>
+  </w:abstractNum>
+  <w:abstractNum w:abstractNumId="7" w15:restartNumberingAfterBreak="0">
     <w:nsid w:val="2C0B4F3A"/>
     <w:multiLevelType w:val="multilevel"/>
     <w:tmpl w:val="481603D0"/>
@@ -10407,7 +11324,7 @@
       </w:rPr>
     </w:lvl>
   </w:abstractNum>
-  <w:abstractNum w:abstractNumId="6" w15:restartNumberingAfterBreak="0">
+  <w:abstractNum w:abstractNumId="8" w15:restartNumberingAfterBreak="0">
     <w:nsid w:val="35595581"/>
     <w:multiLevelType w:val="multilevel"/>
     <w:tmpl w:val="E12AC5B0"/>
@@ -10520,7 +11437,7 @@
       </w:pPr>
     </w:lvl>
   </w:abstractNum>
-  <w:abstractNum w:abstractNumId="7" w15:restartNumberingAfterBreak="0">
+  <w:abstractNum w:abstractNumId="9" w15:restartNumberingAfterBreak="0">
     <w:nsid w:val="37EB655A"/>
     <w:multiLevelType w:val="multilevel"/>
     <w:tmpl w:val="EF32D864"/>
@@ -10669,7 +11586,7 @@
       </w:rPr>
     </w:lvl>
   </w:abstractNum>
-  <w:abstractNum w:abstractNumId="8" w15:restartNumberingAfterBreak="0">
+  <w:abstractNum w:abstractNumId="10" w15:restartNumberingAfterBreak="0">
     <w:nsid w:val="3B530F9F"/>
     <w:multiLevelType w:val="multilevel"/>
     <w:tmpl w:val="D8F84B4A"/>
@@ -10818,7 +11735,7 @@
       </w:rPr>
     </w:lvl>
   </w:abstractNum>
-  <w:abstractNum w:abstractNumId="9" w15:restartNumberingAfterBreak="0">
+  <w:abstractNum w:abstractNumId="11" w15:restartNumberingAfterBreak="0">
     <w:nsid w:val="42E16BF5"/>
     <w:multiLevelType w:val="multilevel"/>
     <w:tmpl w:val="C742BB0E"/>
@@ -10967,7 +11884,7 @@
       </w:rPr>
     </w:lvl>
   </w:abstractNum>
-  <w:abstractNum w:abstractNumId="10" w15:restartNumberingAfterBreak="0">
+  <w:abstractNum w:abstractNumId="12" w15:restartNumberingAfterBreak="0">
     <w:nsid w:val="48692A8A"/>
     <w:multiLevelType w:val="multilevel"/>
     <w:tmpl w:val="3264A654"/>
@@ -11116,7 +12033,7 @@
       </w:rPr>
     </w:lvl>
   </w:abstractNum>
-  <w:abstractNum w:abstractNumId="11" w15:restartNumberingAfterBreak="0">
+  <w:abstractNum w:abstractNumId="13" w15:restartNumberingAfterBreak="0">
     <w:nsid w:val="55364149"/>
     <w:multiLevelType w:val="hybridMultilevel"/>
     <w:tmpl w:val="8EEEC712"/>
@@ -11229,7 +12146,7 @@
       </w:rPr>
     </w:lvl>
   </w:abstractNum>
-  <w:abstractNum w:abstractNumId="12" w15:restartNumberingAfterBreak="0">
+  <w:abstractNum w:abstractNumId="14" w15:restartNumberingAfterBreak="0">
     <w:nsid w:val="55530E51"/>
     <w:multiLevelType w:val="multilevel"/>
     <w:tmpl w:val="D966D32E"/>
@@ -11378,7 +12295,7 @@
       </w:rPr>
     </w:lvl>
   </w:abstractNum>
-  <w:abstractNum w:abstractNumId="13" w15:restartNumberingAfterBreak="0">
+  <w:abstractNum w:abstractNumId="15" w15:restartNumberingAfterBreak="0">
     <w:nsid w:val="56E54577"/>
     <w:multiLevelType w:val="multilevel"/>
     <w:tmpl w:val="3110975A"/>
@@ -11527,7 +12444,7 @@
       </w:rPr>
     </w:lvl>
   </w:abstractNum>
-  <w:abstractNum w:abstractNumId="14" w15:restartNumberingAfterBreak="0">
+  <w:abstractNum w:abstractNumId="16" w15:restartNumberingAfterBreak="0">
     <w:nsid w:val="594746C4"/>
     <w:multiLevelType w:val="multilevel"/>
     <w:tmpl w:val="324ACA76"/>
@@ -11640,7 +12557,7 @@
       </w:pPr>
     </w:lvl>
   </w:abstractNum>
-  <w:abstractNum w:abstractNumId="15" w15:restartNumberingAfterBreak="0">
+  <w:abstractNum w:abstractNumId="17" w15:restartNumberingAfterBreak="0">
     <w:nsid w:val="5EB80AEC"/>
     <w:multiLevelType w:val="multilevel"/>
     <w:tmpl w:val="7B700978"/>
@@ -11789,7 +12706,7 @@
       </w:rPr>
     </w:lvl>
   </w:abstractNum>
-  <w:abstractNum w:abstractNumId="16" w15:restartNumberingAfterBreak="0">
+  <w:abstractNum w:abstractNumId="18" w15:restartNumberingAfterBreak="0">
     <w:nsid w:val="5F8A71CD"/>
     <w:multiLevelType w:val="multilevel"/>
     <w:tmpl w:val="4322C53A"/>
@@ -11938,7 +12855,7 @@
       </w:rPr>
     </w:lvl>
   </w:abstractNum>
-  <w:abstractNum w:abstractNumId="17" w15:restartNumberingAfterBreak="0">
+  <w:abstractNum w:abstractNumId="19" w15:restartNumberingAfterBreak="0">
     <w:nsid w:val="615F4899"/>
     <w:multiLevelType w:val="multilevel"/>
     <w:tmpl w:val="C9266CD0"/>
@@ -12078,7 +12995,7 @@
       </w:rPr>
     </w:lvl>
   </w:abstractNum>
-  <w:abstractNum w:abstractNumId="18" w15:restartNumberingAfterBreak="0">
+  <w:abstractNum w:abstractNumId="20" w15:restartNumberingAfterBreak="0">
     <w:nsid w:val="62AC304F"/>
     <w:multiLevelType w:val="multilevel"/>
     <w:tmpl w:val="13F60C32"/>
@@ -12227,7 +13144,7 @@
       </w:rPr>
     </w:lvl>
   </w:abstractNum>
-  <w:abstractNum w:abstractNumId="19" w15:restartNumberingAfterBreak="0">
+  <w:abstractNum w:abstractNumId="21" w15:restartNumberingAfterBreak="0">
     <w:nsid w:val="67AC6D9E"/>
     <w:multiLevelType w:val="multilevel"/>
     <w:tmpl w:val="0DE8EAB4"/>
@@ -12376,7 +13293,156 @@
       </w:rPr>
     </w:lvl>
   </w:abstractNum>
-  <w:abstractNum w:abstractNumId="20" w15:restartNumberingAfterBreak="0">
+  <w:abstractNum w:abstractNumId="22" w15:restartNumberingAfterBreak="0">
+    <w:nsid w:val="69F365D2"/>
+    <w:multiLevelType w:val="multilevel"/>
+    <w:tmpl w:val="0FF2F962"/>
+    <w:lvl w:ilvl="0">
+      <w:start w:val="1"/>
+      <w:numFmt w:val="bullet"/>
+      <w:lvlText w:val=""/>
+      <w:lvlJc w:val="left"/>
+      <w:pPr>
+        <w:tabs>
+          <w:tab w:val="num" w:pos="720"/>
+        </w:tabs>
+        <w:ind w:left="720" w:hanging="360"/>
+      </w:pPr>
+      <w:rPr>
+        <w:rFonts w:ascii="Symbol" w:hAnsi="Symbol" w:hint="default"/>
+        <w:sz w:val="20"/>
+      </w:rPr>
+    </w:lvl>
+    <w:lvl w:ilvl="1">
+      <w:start w:val="1"/>
+      <w:numFmt w:val="bullet"/>
+      <w:lvlText w:val="o"/>
+      <w:lvlJc w:val="left"/>
+      <w:pPr>
+        <w:tabs>
+          <w:tab w:val="num" w:pos="1440"/>
+        </w:tabs>
+        <w:ind w:left="1440" w:hanging="360"/>
+      </w:pPr>
+      <w:rPr>
+        <w:rFonts w:ascii="Courier New" w:hAnsi="Courier New" w:hint="default"/>
+        <w:sz w:val="20"/>
+      </w:rPr>
+    </w:lvl>
+    <w:lvl w:ilvl="2" w:tentative="1">
+      <w:start w:val="1"/>
+      <w:numFmt w:val="bullet"/>
+      <w:lvlText w:val=""/>
+      <w:lvlJc w:val="left"/>
+      <w:pPr>
+        <w:tabs>
+          <w:tab w:val="num" w:pos="2160"/>
+        </w:tabs>
+        <w:ind w:left="2160" w:hanging="360"/>
+      </w:pPr>
+      <w:rPr>
+        <w:rFonts w:ascii="Wingdings" w:hAnsi="Wingdings" w:hint="default"/>
+        <w:sz w:val="20"/>
+      </w:rPr>
+    </w:lvl>
+    <w:lvl w:ilvl="3" w:tentative="1">
+      <w:start w:val="1"/>
+      <w:numFmt w:val="bullet"/>
+      <w:lvlText w:val=""/>
+      <w:lvlJc w:val="left"/>
+      <w:pPr>
+        <w:tabs>
+          <w:tab w:val="num" w:pos="2880"/>
+        </w:tabs>
+        <w:ind w:left="2880" w:hanging="360"/>
+      </w:pPr>
+      <w:rPr>
+        <w:rFonts w:ascii="Wingdings" w:hAnsi="Wingdings" w:hint="default"/>
+        <w:sz w:val="20"/>
+      </w:rPr>
+    </w:lvl>
+    <w:lvl w:ilvl="4" w:tentative="1">
+      <w:start w:val="1"/>
+      <w:numFmt w:val="bullet"/>
+      <w:lvlText w:val=""/>
+      <w:lvlJc w:val="left"/>
+      <w:pPr>
+        <w:tabs>
+          <w:tab w:val="num" w:pos="3600"/>
+        </w:tabs>
+        <w:ind w:left="3600" w:hanging="360"/>
+      </w:pPr>
+      <w:rPr>
+        <w:rFonts w:ascii="Wingdings" w:hAnsi="Wingdings" w:hint="default"/>
+        <w:sz w:val="20"/>
+      </w:rPr>
+    </w:lvl>
+    <w:lvl w:ilvl="5" w:tentative="1">
+      <w:start w:val="1"/>
+      <w:numFmt w:val="bullet"/>
+      <w:lvlText w:val=""/>
+      <w:lvlJc w:val="left"/>
+      <w:pPr>
+        <w:tabs>
+          <w:tab w:val="num" w:pos="4320"/>
+        </w:tabs>
+        <w:ind w:left="4320" w:hanging="360"/>
+      </w:pPr>
+      <w:rPr>
+        <w:rFonts w:ascii="Wingdings" w:hAnsi="Wingdings" w:hint="default"/>
+        <w:sz w:val="20"/>
+      </w:rPr>
+    </w:lvl>
+    <w:lvl w:ilvl="6" w:tentative="1">
+      <w:start w:val="1"/>
+      <w:numFmt w:val="bullet"/>
+      <w:lvlText w:val=""/>
+      <w:lvlJc w:val="left"/>
+      <w:pPr>
+        <w:tabs>
+          <w:tab w:val="num" w:pos="5040"/>
+        </w:tabs>
+        <w:ind w:left="5040" w:hanging="360"/>
+      </w:pPr>
+      <w:rPr>
+        <w:rFonts w:ascii="Wingdings" w:hAnsi="Wingdings" w:hint="default"/>
+        <w:sz w:val="20"/>
+      </w:rPr>
+    </w:lvl>
+    <w:lvl w:ilvl="7" w:tentative="1">
+      <w:start w:val="1"/>
+      <w:numFmt w:val="bullet"/>
+      <w:lvlText w:val=""/>
+      <w:lvlJc w:val="left"/>
+      <w:pPr>
+        <w:tabs>
+          <w:tab w:val="num" w:pos="5760"/>
+        </w:tabs>
+        <w:ind w:left="5760" w:hanging="360"/>
+      </w:pPr>
+      <w:rPr>
+        <w:rFonts w:ascii="Wingdings" w:hAnsi="Wingdings" w:hint="default"/>
+        <w:sz w:val="20"/>
+      </w:rPr>
+    </w:lvl>
+    <w:lvl w:ilvl="8" w:tentative="1">
+      <w:start w:val="1"/>
+      <w:numFmt w:val="bullet"/>
+      <w:lvlText w:val=""/>
+      <w:lvlJc w:val="left"/>
+      <w:pPr>
+        <w:tabs>
+          <w:tab w:val="num" w:pos="6480"/>
+        </w:tabs>
+        <w:ind w:left="6480" w:hanging="360"/>
+      </w:pPr>
+      <w:rPr>
+        <w:rFonts w:ascii="Wingdings" w:hAnsi="Wingdings" w:hint="default"/>
+        <w:sz w:val="20"/>
+      </w:rPr>
+    </w:lvl>
+  </w:abstractNum>
+  <w:abstractNum w:abstractNumId="23" w15:restartNumberingAfterBreak="0">
     <w:nsid w:val="728521D6"/>
     <w:multiLevelType w:val="multilevel"/>
     <w:tmpl w:val="7A00D950"/>
@@ -12525,7 +13591,7 @@
       </w:rPr>
     </w:lvl>
   </w:abstractNum>
-  <w:abstractNum w:abstractNumId="21" w15:restartNumberingAfterBreak="0">
+  <w:abstractNum w:abstractNumId="24" w15:restartNumberingAfterBreak="0">
     <w:nsid w:val="755F0692"/>
     <w:multiLevelType w:val="multilevel"/>
     <w:tmpl w:val="63C051FA"/>
@@ -12674,7 +13740,7 @@
       </w:rPr>
     </w:lvl>
   </w:abstractNum>
-  <w:abstractNum w:abstractNumId="22" w15:restartNumberingAfterBreak="0">
+  <w:abstractNum w:abstractNumId="25" w15:restartNumberingAfterBreak="0">
     <w:nsid w:val="7A9E54C7"/>
     <w:multiLevelType w:val="multilevel"/>
     <w:tmpl w:val="5C34A218"/>
@@ -12824,73 +13890,82 @@
     </w:lvl>
   </w:abstractNum>
   <w:num w:numId="1" w16cid:durableId="1224100648">
-    <w:abstractNumId w:val="10"/>
+    <w:abstractNumId w:val="12"/>
   </w:num>
   <w:num w:numId="2" w16cid:durableId="462499139">
-    <w:abstractNumId w:val="2"/>
+    <w:abstractNumId w:val="3"/>
   </w:num>
   <w:num w:numId="3" w16cid:durableId="1084182276">
+    <w:abstractNumId w:val="7"/>
+  </w:num>
+  <w:num w:numId="4" w16cid:durableId="1293175750">
     <w:abstractNumId w:val="5"/>
   </w:num>
-  <w:num w:numId="4" w16cid:durableId="1293175750">
-    <w:abstractNumId w:val="4"/>
-  </w:num>
   <w:num w:numId="5" w16cid:durableId="1385904858">
-    <w:abstractNumId w:val="9"/>
+    <w:abstractNumId w:val="11"/>
   </w:num>
   <w:num w:numId="6" w16cid:durableId="422070613">
     <w:abstractNumId w:val="1"/>
   </w:num>
   <w:num w:numId="7" w16cid:durableId="751925626">
+    <w:abstractNumId w:val="19"/>
+  </w:num>
+  <w:num w:numId="8" w16cid:durableId="916011410">
+    <w:abstractNumId w:val="23"/>
+  </w:num>
+  <w:num w:numId="9" w16cid:durableId="1542210779">
     <w:abstractNumId w:val="17"/>
   </w:num>
-  <w:num w:numId="8" w16cid:durableId="916011410">
+  <w:num w:numId="10" w16cid:durableId="51738587">
+    <w:abstractNumId w:val="15"/>
+  </w:num>
+  <w:num w:numId="11" w16cid:durableId="1922643781">
+    <w:abstractNumId w:val="25"/>
+  </w:num>
+  <w:num w:numId="12" w16cid:durableId="2051178246">
+    <w:abstractNumId w:val="13"/>
+  </w:num>
+  <w:num w:numId="13" w16cid:durableId="741483305">
+    <w:abstractNumId w:val="24"/>
+  </w:num>
+  <w:num w:numId="14" w16cid:durableId="804545772">
+    <w:abstractNumId w:val="4"/>
+  </w:num>
+  <w:num w:numId="15" w16cid:durableId="740255216">
     <w:abstractNumId w:val="20"/>
   </w:num>
-  <w:num w:numId="9" w16cid:durableId="1542210779">
-    <w:abstractNumId w:val="15"/>
+  <w:num w:numId="16" w16cid:durableId="1796437131">
+    <w:abstractNumId w:val="18"/>
   </w:num>
-  <w:num w:numId="10" w16cid:durableId="51738587">
-    <w:abstractNumId w:val="13"/>
+  <w:num w:numId="17" w16cid:durableId="1965430249">
+    <w:abstractNumId w:val="10"/>
   </w:num>
-  <w:num w:numId="11" w16cid:durableId="1922643781">
-    <w:abstractNumId w:val="22"/>
+  <w:num w:numId="18" w16cid:durableId="1594434646">
+    <w:abstractNumId w:val="16"/>
   </w:num>
-  <w:num w:numId="12" w16cid:durableId="2051178246">
-    <w:abstractNumId w:val="11"/>
+  <w:num w:numId="19" w16cid:durableId="1324623867">
+    <w:abstractNumId w:val="8"/>
   </w:num>
-  <w:num w:numId="13" w16cid:durableId="741483305">
+  <w:num w:numId="20" w16cid:durableId="456679612">
+    <w:abstractNumId w:val="9"/>
+  </w:num>
+  <w:num w:numId="21" w16cid:durableId="1034427986">
     <w:abstractNumId w:val="21"/>
   </w:num>
-  <w:num w:numId="14" w16cid:durableId="804545772">
-    <w:abstractNumId w:val="3"/>
-  </w:num>
-  <w:num w:numId="15" w16cid:durableId="740255216">
-    <w:abstractNumId w:val="18"/>
-  </w:num>
-  <w:num w:numId="16" w16cid:durableId="1796437131">
-    <w:abstractNumId w:val="16"/>
-  </w:num>
-  <w:num w:numId="17" w16cid:durableId="1965430249">
-    <w:abstractNumId w:val="8"/>
-  </w:num>
-  <w:num w:numId="18" w16cid:durableId="1594434646">
+  <w:num w:numId="22" w16cid:durableId="593825333">
     <w:abstractNumId w:val="14"/>
-  </w:num>
-  <w:num w:numId="19" w16cid:durableId="1324623867">
-    <w:abstractNumId w:val="6"/>
-  </w:num>
-  <w:num w:numId="20" w16cid:durableId="456679612">
-    <w:abstractNumId w:val="7"/>
-  </w:num>
-  <w:num w:numId="21" w16cid:durableId="1034427986">
-    <w:abstractNumId w:val="19"/>
-  </w:num>
-  <w:num w:numId="22" w16cid:durableId="593825333">
-    <w:abstractNumId w:val="12"/>
   </w:num>
   <w:num w:numId="23" w16cid:durableId="1687293907">
     <w:abstractNumId w:val="0"/>
+  </w:num>
+  <w:num w:numId="24" w16cid:durableId="1376656309">
+    <w:abstractNumId w:val="6"/>
+  </w:num>
+  <w:num w:numId="25" w16cid:durableId="1996060358">
+    <w:abstractNumId w:val="2"/>
+  </w:num>
+  <w:num w:numId="26" w16cid:durableId="1775511361">
+    <w:abstractNumId w:val="22"/>
   </w:num>
 </w:numbering>
 </file>

</xml_diff>

<commit_message>
Adding SkyRoof Windows Notes and Manual
</commit_message>
<xml_diff>
--- a/Project_Management/Frequency_Survey.docx
+++ b/Project_Management/Frequency_Survey.docx
@@ -452,15 +452,7 @@
           </w:tcPr>
           <w:p>
             <w:r>
-              <w:t> 4/21/</w:t>
-            </w:r>
-            <w:proofErr w:type="gramStart"/>
-            <w:r>
-              <w:t>2025  at</w:t>
-            </w:r>
-            <w:proofErr w:type="gramEnd"/>
-            <w:r>
-              <w:t>  2:47 PM</w:t>
+              <w:t> 4/21/2025  at  2:47 PM</w:t>
             </w:r>
           </w:p>
         </w:tc>
@@ -1686,21 +1678,7 @@
         <w:rPr>
           <w:color w:val="FF0000"/>
         </w:rPr>
-        <w:t>BAD IP</w:t>
-      </w:r>
-      <w:proofErr w:type="gramStart"/>
-      <w:r>
-        <w:rPr>
-          <w:color w:val="FF0000"/>
-        </w:rPr>
-        <w:t>:  198.168</w:t>
-      </w:r>
-      <w:proofErr w:type="gramEnd"/>
-      <w:r>
-        <w:rPr>
-          <w:color w:val="FF0000"/>
-        </w:rPr>
-        <w:t>.4.190</w:t>
+        <w:t>BAD IP:  198.168.4.190</w:t>
       </w:r>
       <w:r>
         <w:rPr>
@@ -1851,6 +1829,14 @@
       </w:r>
     </w:p>
     <w:p>
+      <w:proofErr w:type="spellStart"/>
+      <w:r>
+        <w:t>sudo</w:t>
+      </w:r>
+      <w:proofErr w:type="spellEnd"/>
+      <w:r>
+        <w:t xml:space="preserve"> </w:t>
+      </w:r>
       <w:r>
         <w:t>shutdown -h now</w:t>
       </w:r>
@@ -1950,15 +1936,7 @@
     <w:p>
       <w:r>
         <w:lastRenderedPageBreak/>
-        <w:t>unicycle9312@</w:t>
-      </w:r>
-      <w:proofErr w:type="gramStart"/>
-      <w:r>
-        <w:t>Frequency:~</w:t>
-      </w:r>
-      <w:proofErr w:type="gramEnd"/>
-      <w:r>
-        <w:t xml:space="preserve"> $ cp rtl-sdr/rtl_power/heatmap.py ~/</w:t>
+        <w:t>unicycle9312@Frequency:~ $ cp rtl-sdr/rtl_power/heatmap.py ~/</w:t>
       </w:r>
       <w:proofErr w:type="spellStart"/>
       <w:r>
@@ -1992,161 +1970,71 @@
     </w:p>
     <w:p>
       <w:r>
-        <w:t>unicycle9312@</w:t>
-      </w:r>
-      <w:proofErr w:type="gramStart"/>
-      <w:r>
-        <w:t>Frequency:~</w:t>
-      </w:r>
-      <w:proofErr w:type="gramEnd"/>
+        <w:t>unicycle9312@Frequency:~ $ ls</w:t>
+      </w:r>
+    </w:p>
+    <w:p>
+      <w:r>
+        <w:t xml:space="preserve">Bookshelf  Desktop  Documents  Downloads  Music  Pictures  Public  </w:t>
+      </w:r>
+      <w:proofErr w:type="spellStart"/>
+      <w:r>
+        <w:t>rtl-sdr</w:t>
+      </w:r>
+      <w:proofErr w:type="spellEnd"/>
+      <w:r>
+        <w:t xml:space="preserve">  Templates  Videos</w:t>
+      </w:r>
+    </w:p>
+    <w:p>
+      <w:r>
+        <w:t xml:space="preserve">unicycle9312@Frequency:~ $ cd </w:t>
+      </w:r>
+      <w:proofErr w:type="spellStart"/>
+      <w:r>
+        <w:t>rtl-sdr</w:t>
+      </w:r>
+      <w:proofErr w:type="spellEnd"/>
+    </w:p>
+    <w:p>
+      <w:r>
+        <w:t>unicycle9312@Frequency:~/</w:t>
+      </w:r>
+      <w:proofErr w:type="spellStart"/>
+      <w:r>
+        <w:t>rtl-sdr</w:t>
+      </w:r>
+      <w:proofErr w:type="spellEnd"/>
       <w:r>
         <w:t xml:space="preserve"> $ ls</w:t>
       </w:r>
     </w:p>
     <w:p>
-      <w:proofErr w:type="gramStart"/>
-      <w:r>
-        <w:t>Bookshelf  Desktop</w:t>
-      </w:r>
-      <w:proofErr w:type="gramEnd"/>
-      <w:r>
-        <w:t xml:space="preserve">  </w:t>
-      </w:r>
-      <w:proofErr w:type="gramStart"/>
-      <w:r>
-        <w:t>Documents  Downloads</w:t>
-      </w:r>
-      <w:proofErr w:type="gramEnd"/>
-      <w:r>
-        <w:t xml:space="preserve">  </w:t>
-      </w:r>
-      <w:proofErr w:type="gramStart"/>
-      <w:r>
-        <w:t>Music  Pictures</w:t>
-      </w:r>
-      <w:proofErr w:type="gramEnd"/>
-      <w:r>
-        <w:t xml:space="preserve">  </w:t>
-      </w:r>
-      <w:proofErr w:type="gramStart"/>
-      <w:r>
-        <w:t xml:space="preserve">Public  </w:t>
+      <w:r>
+        <w:t xml:space="preserve">AUTHORS  CMakeLists.txt  COPYING      git-version-gen  librtlsdr.pc.in  Makefile.am  </w:t>
       </w:r>
       <w:proofErr w:type="spellStart"/>
       <w:r>
-        <w:t>rtl</w:t>
-      </w:r>
-      <w:proofErr w:type="gramEnd"/>
-      <w:r>
-        <w:t>-</w:t>
-      </w:r>
-      <w:proofErr w:type="gramStart"/>
-      <w:r>
-        <w:t>sdr</w:t>
+        <w:t>rtlsdr.conf</w:t>
       </w:r>
       <w:proofErr w:type="spellEnd"/>
       <w:r>
-        <w:t xml:space="preserve">  Templates</w:t>
-      </w:r>
-      <w:proofErr w:type="gramEnd"/>
-      <w:r>
-        <w:t xml:space="preserve">  Videos</w:t>
-      </w:r>
-    </w:p>
-    <w:p>
-      <w:r>
-        <w:t>unicycle9312@</w:t>
-      </w:r>
-      <w:proofErr w:type="gramStart"/>
-      <w:r>
-        <w:t>Frequency:~</w:t>
-      </w:r>
-      <w:proofErr w:type="gramEnd"/>
-      <w:r>
-        <w:t xml:space="preserve"> $ cd </w:t>
+        <w:t xml:space="preserve">    </w:t>
       </w:r>
       <w:proofErr w:type="spellStart"/>
       <w:r>
-        <w:t>rtl-sdr</w:t>
+        <w:t>src</w:t>
       </w:r>
       <w:proofErr w:type="spellEnd"/>
     </w:p>
     <w:p>
-      <w:r>
-        <w:t>unicycle9312@</w:t>
-      </w:r>
-      <w:proofErr w:type="gramStart"/>
-      <w:r>
-        <w:t>Frequency:~</w:t>
-      </w:r>
-      <w:proofErr w:type="gramEnd"/>
-      <w:r>
-        <w:t>/</w:t>
-      </w:r>
       <w:proofErr w:type="spellStart"/>
       <w:r>
-        <w:t>rtl-sdr</w:t>
+        <w:t>cmake</w:t>
       </w:r>
       <w:proofErr w:type="spellEnd"/>
       <w:r>
-        <w:t xml:space="preserve"> $ ls</w:t>
-      </w:r>
-    </w:p>
-    <w:p>
-      <w:proofErr w:type="gramStart"/>
-      <w:r>
-        <w:t>AUTHORS  CMakeLists.txt</w:t>
-      </w:r>
-      <w:proofErr w:type="gramEnd"/>
-      <w:r>
-        <w:t xml:space="preserve">  COPYING      git-version-</w:t>
-      </w:r>
-      <w:proofErr w:type="gramStart"/>
-      <w:r>
-        <w:t>gen  librtlsdr.pc.in</w:t>
-      </w:r>
-      <w:proofErr w:type="gramEnd"/>
-      <w:r>
-        <w:t xml:space="preserve">  </w:t>
-      </w:r>
-      <w:proofErr w:type="gramStart"/>
-      <w:r>
-        <w:t xml:space="preserve">Makefile.am  </w:t>
-      </w:r>
-      <w:proofErr w:type="spellStart"/>
-      <w:r>
-        <w:t>rtlsdr</w:t>
-      </w:r>
-      <w:proofErr w:type="gramEnd"/>
-      <w:r>
-        <w:t>.conf</w:t>
-      </w:r>
-      <w:proofErr w:type="spellEnd"/>
-      <w:r>
-        <w:t xml:space="preserve">    </w:t>
-      </w:r>
-      <w:proofErr w:type="spellStart"/>
-      <w:r>
-        <w:t>src</w:t>
-      </w:r>
-      <w:proofErr w:type="spellEnd"/>
-    </w:p>
-    <w:p>
-      <w:proofErr w:type="spellStart"/>
-      <w:r>
-        <w:t>cmake</w:t>
-      </w:r>
-      <w:proofErr w:type="spellEnd"/>
-      <w:r>
-        <w:t xml:space="preserve">    configure.ac    </w:t>
-      </w:r>
-      <w:proofErr w:type="gramStart"/>
-      <w:r>
-        <w:t>Doxyfile.in  include</w:t>
-      </w:r>
-      <w:proofErr w:type="gramEnd"/>
-      <w:r>
-        <w:t xml:space="preserve">          m4               README       </w:t>
+        <w:t xml:space="preserve">    configure.ac    Doxyfile.in  include          m4               README       </w:t>
       </w:r>
       <w:proofErr w:type="spellStart"/>
       <w:r>
@@ -2165,15 +2053,7 @@
     <w:p/>
     <w:p>
       <w:r>
-        <w:t>unicycle9312@</w:t>
-      </w:r>
-      <w:proofErr w:type="gramStart"/>
-      <w:r>
-        <w:t>Frequency:~</w:t>
-      </w:r>
-      <w:proofErr w:type="gramEnd"/>
-      <w:r>
-        <w:t>/</w:t>
+        <w:t>unicycle9312@Frequency:~/</w:t>
       </w:r>
       <w:proofErr w:type="spellStart"/>
       <w:r>
@@ -2191,15 +2071,7 @@
     </w:p>
     <w:p>
       <w:r>
-        <w:t>unicycle9312@</w:t>
-      </w:r>
-      <w:proofErr w:type="gramStart"/>
-      <w:r>
-        <w:t>Frequency:~</w:t>
-      </w:r>
-      <w:proofErr w:type="gramEnd"/>
-      <w:r>
-        <w:t>/</w:t>
+        <w:t>unicycle9312@Frequency:~/</w:t>
       </w:r>
       <w:proofErr w:type="spellStart"/>
       <w:r>
@@ -2796,33 +2668,15 @@
           <w:bCs/>
           <w:color w:val="00B050"/>
         </w:rPr>
-        <w:t xml:space="preserve">python3 </w:t>
-      </w:r>
-      <w:proofErr w:type="gramStart"/>
+        <w:t xml:space="preserve">python3 heatmap.py  </w:t>
+      </w:r>
       <w:r>
         <w:rPr>
           <w:b/>
           <w:bCs/>
           <w:color w:val="00B050"/>
         </w:rPr>
-        <w:t xml:space="preserve">heatmap.py  </w:t>
-      </w:r>
-      <w:r>
-        <w:rPr>
-          <w:b/>
-          <w:bCs/>
-          <w:color w:val="00B050"/>
-        </w:rPr>
-        <w:t>~</w:t>
-      </w:r>
-      <w:proofErr w:type="gramEnd"/>
-      <w:r>
-        <w:rPr>
-          <w:b/>
-          <w:bCs/>
-          <w:color w:val="00B050"/>
-        </w:rPr>
-        <w:t>/Documents/Repositories/D-Star/Frequency_Survey/Data/2025_04_24</w:t>
+        <w:t>~/Documents/Repositories/D-Star/Frequency_Survey/Data/2025_04_24</w:t>
       </w:r>
       <w:r>
         <w:rPr>
@@ -2937,12 +2791,10 @@
         <w:t xml:space="preserve">  s = </w:t>
       </w:r>
       <w:proofErr w:type="spellStart"/>
-      <w:proofErr w:type="gramStart"/>
       <w:r>
         <w:t>f.getsize</w:t>
       </w:r>
       <w:proofErr w:type="spellEnd"/>
-      <w:proofErr w:type="gramEnd"/>
       <w:r>
         <w:t>(label)</w:t>
       </w:r>
@@ -2982,32 +2834,11 @@
       </w:r>
       <w:proofErr w:type="spellStart"/>
       <w:r>
-        <w:t>w_</w:t>
-      </w:r>
-      <w:proofErr w:type="gramStart"/>
-      <w:r>
-        <w:t>img.resize</w:t>
+        <w:t>w_img.resize</w:t>
       </w:r>
       <w:proofErr w:type="spellEnd"/>
-      <w:proofErr w:type="gramEnd"/>
-      <w:r>
-        <w:t>((</w:t>
-      </w:r>
-      <w:proofErr w:type="gramStart"/>
-      <w:r>
-        <w:t>s[0]/</w:t>
-      </w:r>
-      <w:proofErr w:type="gramEnd"/>
-      <w:r>
-        <w:t xml:space="preserve">/3, </w:t>
-      </w:r>
-      <w:proofErr w:type="gramStart"/>
-      <w:r>
-        <w:t>s[</w:t>
-      </w:r>
-      <w:proofErr w:type="gramEnd"/>
-      <w:r>
-        <w:t xml:space="preserve">1]//3), </w:t>
+      <w:r>
+        <w:t xml:space="preserve">((s[0]//3, s[1]//3), </w:t>
       </w:r>
       <w:proofErr w:type="spellStart"/>
       <w:r>
@@ -3060,25 +2891,7 @@
           <w:bCs/>
           <w:color w:val="00B050"/>
         </w:rPr>
-        <w:t xml:space="preserve">python3 </w:t>
-      </w:r>
-      <w:proofErr w:type="gramStart"/>
-      <w:r>
-        <w:rPr>
-          <w:b/>
-          <w:bCs/>
-          <w:color w:val="00B050"/>
-        </w:rPr>
-        <w:t>heatmap.py  ~</w:t>
-      </w:r>
-      <w:proofErr w:type="gramEnd"/>
-      <w:r>
-        <w:rPr>
-          <w:b/>
-          <w:bCs/>
-          <w:color w:val="00B050"/>
-        </w:rPr>
-        <w:t>/Documents/Repositories/D-Star/Frequency_Survey/Data/2025_04_24/traffic</w:t>
+        <w:t>python3 heatmap.py  ~/Documents/Repositories/D-Star/Frequency_Survey/Data/2025_04_24/traffic</w:t>
       </w:r>
       <w:r>
         <w:rPr>
@@ -3795,15 +3608,7 @@
         <w:t>No major new signals</w:t>
       </w:r>
       <w:r>
-        <w:t xml:space="preserve">, suggesting low variation in traffic during this </w:t>
-      </w:r>
-      <w:proofErr w:type="gramStart"/>
-      <w:r>
-        <w:t>time period</w:t>
-      </w:r>
-      <w:proofErr w:type="gramEnd"/>
-      <w:r>
-        <w:t>.</w:t>
+        <w:t>, suggesting low variation in traffic during this time period.</w:t>
       </w:r>
     </w:p>
     <w:p>
@@ -4100,15 +3905,7 @@
           </w:tcPr>
           <w:p>
             <w:r>
-              <w:t xml:space="preserve">Possible </w:t>
-            </w:r>
-            <w:proofErr w:type="gramStart"/>
-            <w:r>
-              <w:t>repeater</w:t>
-            </w:r>
-            <w:proofErr w:type="gramEnd"/>
-            <w:r>
-              <w:t xml:space="preserve"> outputs or unused frequencies</w:t>
+              <w:t>Possible repeater outputs or unused frequencies</w:t>
             </w:r>
           </w:p>
         </w:tc>
@@ -4537,13 +4334,8 @@
             <w:r>
               <w:t>KF5</w:t>
             </w:r>
-            <w:proofErr w:type="gramStart"/>
             <w:r>
-              <w:t>SCI  B</w:t>
-            </w:r>
-            <w:proofErr w:type="gramEnd"/>
-            <w:r>
-              <w:t xml:space="preserve"> </w:t>
+              <w:t xml:space="preserve">SCI  B </w:t>
             </w:r>
             <w:r>
               <w:t xml:space="preserve">  44</w:t>
@@ -4571,15 +4363,7 @@
               <w:t>A</w:t>
             </w:r>
             <w:r>
-              <w:t>F5SH-</w:t>
-            </w:r>
-            <w:proofErr w:type="gramStart"/>
-            <w:r>
-              <w:t>D  449.600</w:t>
-            </w:r>
-            <w:proofErr w:type="gramEnd"/>
-            <w:r>
-              <w:t xml:space="preserve"> </w:t>
+              <w:t xml:space="preserve">F5SH-D  449.600 </w:t>
             </w:r>
             <w:r>
               <w:t>–</w:t>
@@ -4870,25 +4654,23 @@
           <w:bCs/>
           <w:color w:val="00B050"/>
         </w:rPr>
-        <w:t xml:space="preserve">python3 </w:t>
-      </w:r>
-      <w:proofErr w:type="gramStart"/>
+        <w:t>python3 heatmap.py  ~/Documents/Repositories/D-Star/Frequency_Survey/Data/2025_04_2</w:t>
+      </w:r>
       <w:r>
         <w:rPr>
           <w:b/>
           <w:bCs/>
           <w:color w:val="00B050"/>
         </w:rPr>
-        <w:t>heatmap.py  ~</w:t>
-      </w:r>
-      <w:proofErr w:type="gramEnd"/>
+        <w:t>5</w:t>
+      </w:r>
       <w:r>
         <w:rPr>
           <w:b/>
           <w:bCs/>
           <w:color w:val="00B050"/>
         </w:rPr>
-        <w:t>/Documents/Repositories/D-Star/Frequency_Survey/Data/2025_04_2</w:t>
+        <w:t>/</w:t>
       </w:r>
       <w:r>
         <w:rPr>
@@ -4896,6 +4678,38 @@
           <w:bCs/>
           <w:color w:val="00B050"/>
         </w:rPr>
+        <w:t>simple</w:t>
+      </w:r>
+      <w:r>
+        <w:rPr>
+          <w:b/>
+          <w:bCs/>
+          <w:color w:val="00B050"/>
+        </w:rPr>
+        <w:t>x</w:t>
+      </w:r>
+      <w:r>
+        <w:rPr>
+          <w:b/>
+          <w:bCs/>
+          <w:color w:val="00B050"/>
+        </w:rPr>
+        <w:t>1</w:t>
+      </w:r>
+      <w:r>
+        <w:rPr>
+          <w:b/>
+          <w:bCs/>
+          <w:color w:val="00B050"/>
+        </w:rPr>
+        <w:t>.csv ~/Documents/Repositories/D-Star/Frequency_Survey/Data/2025_04_2</w:t>
+      </w:r>
+      <w:r>
+        <w:rPr>
+          <w:b/>
+          <w:bCs/>
+          <w:color w:val="00B050"/>
+        </w:rPr>
         <w:t>5</w:t>
       </w:r>
       <w:r>
@@ -4912,7 +4726,7 @@
           <w:bCs/>
           <w:color w:val="00B050"/>
         </w:rPr>
-        <w:t>simple</w:t>
+        <w:t>Simplex</w:t>
       </w:r>
       <w:r>
         <w:rPr>
@@ -4920,7 +4734,7 @@
           <w:bCs/>
           <w:color w:val="00B050"/>
         </w:rPr>
-        <w:t>x</w:t>
+        <w:t>1</w:t>
       </w:r>
       <w:r>
         <w:rPr>
@@ -4928,99 +4742,33 @@
           <w:bCs/>
           <w:color w:val="00B050"/>
         </w:rPr>
-        <w:t>1</w:t>
-      </w:r>
-      <w:r>
+        <w:t>_Map.png</w:t>
+      </w:r>
+    </w:p>
+    <w:p>
+      <w:pPr>
+        <w:rPr>
+          <w:b/>
+          <w:bCs/>
+          <w:color w:val="FF0000"/>
+        </w:rPr>
+      </w:pPr>
+    </w:p>
+    <w:p>
+      <w:pPr>
         <w:rPr>
           <w:b/>
           <w:bCs/>
           <w:color w:val="00B050"/>
         </w:rPr>
-        <w:t>.csv ~/Documents/Repositories/D-Star/Frequency_Survey/Data/2025_04_2</w:t>
-      </w:r>
+      </w:pPr>
       <w:r>
         <w:rPr>
           <w:b/>
           <w:bCs/>
           <w:color w:val="00B050"/>
         </w:rPr>
-        <w:t>5</w:t>
-      </w:r>
-      <w:r>
-        <w:rPr>
-          <w:b/>
-          <w:bCs/>
-          <w:color w:val="00B050"/>
-        </w:rPr>
-        <w:t>/</w:t>
-      </w:r>
-      <w:r>
-        <w:rPr>
-          <w:b/>
-          <w:bCs/>
-          <w:color w:val="00B050"/>
-        </w:rPr>
-        <w:t>Simplex</w:t>
-      </w:r>
-      <w:r>
-        <w:rPr>
-          <w:b/>
-          <w:bCs/>
-          <w:color w:val="00B050"/>
-        </w:rPr>
-        <w:t>1</w:t>
-      </w:r>
-      <w:r>
-        <w:rPr>
-          <w:b/>
-          <w:bCs/>
-          <w:color w:val="00B050"/>
-        </w:rPr>
-        <w:t>_Map.png</w:t>
-      </w:r>
-    </w:p>
-    <w:p>
-      <w:pPr>
-        <w:rPr>
-          <w:b/>
-          <w:bCs/>
-          <w:color w:val="FF0000"/>
-        </w:rPr>
-      </w:pPr>
-    </w:p>
-    <w:p>
-      <w:pPr>
-        <w:rPr>
-          <w:b/>
-          <w:bCs/>
-          <w:color w:val="00B050"/>
-        </w:rPr>
-      </w:pPr>
-      <w:r>
-        <w:rPr>
-          <w:b/>
-          <w:bCs/>
-          <w:color w:val="00B050"/>
-        </w:rPr>
-        <w:t xml:space="preserve">python3 </w:t>
-      </w:r>
-      <w:proofErr w:type="gramStart"/>
-      <w:r>
-        <w:rPr>
-          <w:b/>
-          <w:bCs/>
-          <w:color w:val="00B050"/>
-        </w:rPr>
-        <w:t>heatmap.py  ~</w:t>
-      </w:r>
-      <w:proofErr w:type="gramEnd"/>
-      <w:r>
-        <w:rPr>
-          <w:b/>
-          <w:bCs/>
-          <w:color w:val="00B050"/>
-        </w:rPr>
-        <w:t>/Documents/Repositories/D-Star/Frequency_Survey/Data/2025_04_25/simplex24.csv ~/Documents/Repositories/D-Star/Frequency_Survey/Data/2025_04_25/Simplex24_Map.png</w:t>
+        <w:t>python3 heatmap.py  ~/Documents/Repositories/D-Star/Frequency_Survey/Data/2025_04_25/simplex24.csv ~/Documents/Repositories/D-Star/Frequency_Survey/Data/2025_04_25/Simplex24_Map.png</w:t>
       </w:r>
     </w:p>
     <w:p>
@@ -5122,15 +4870,7 @@
     <w:p/>
     <w:p>
       <w:r>
-        <w:t xml:space="preserve">Yes, let’s dive into these new </w:t>
-      </w:r>
-      <w:proofErr w:type="gramStart"/>
-      <w:r>
-        <w:t>heatmaps</w:t>
-      </w:r>
-      <w:proofErr w:type="gramEnd"/>
-      <w:r>
-        <w:t xml:space="preserve"> you posted!</w:t>
+        <w:t>Yes, let’s dive into these new heatmaps you posted!</w:t>
       </w:r>
     </w:p>
     <w:p>
@@ -5315,15 +5055,7 @@
       </w:r>
       <w:r>
         <w:br/>
-        <w:t xml:space="preserve">It’s </w:t>
-      </w:r>
-      <w:proofErr w:type="gramStart"/>
-      <w:r>
-        <w:t>likely</w:t>
-      </w:r>
-      <w:proofErr w:type="gramEnd"/>
-      <w:r>
-        <w:t xml:space="preserve"> some </w:t>
+        <w:t xml:space="preserve">It’s likely some </w:t>
       </w:r>
       <w:r>
         <w:rPr>
@@ -5534,7 +5266,6 @@
       <w:r>
         <w:t xml:space="preserve"> The strong transmission </w:t>
       </w:r>
-      <w:proofErr w:type="gramStart"/>
       <w:r>
         <w:rPr>
           <w:i/>
@@ -5542,7 +5273,6 @@
         </w:rPr>
         <w:t>stopped</w:t>
       </w:r>
-      <w:proofErr w:type="gramEnd"/>
       <w:r>
         <w:t xml:space="preserve"> and the band went </w:t>
       </w:r>
@@ -5569,15 +5299,7 @@
         </w:numPr>
       </w:pPr>
       <w:r>
-        <w:t xml:space="preserve">The source (repeater or </w:t>
-      </w:r>
-      <w:proofErr w:type="gramStart"/>
-      <w:r>
-        <w:t>other</w:t>
-      </w:r>
-      <w:proofErr w:type="gramEnd"/>
-      <w:r>
-        <w:t xml:space="preserve"> emitter) was </w:t>
+        <w:t xml:space="preserve">The source (repeater or other emitter) was </w:t>
       </w:r>
       <w:r>
         <w:rPr>
@@ -6129,15 +5851,7 @@
     </w:p>
     <w:p>
       <w:r>
-        <w:t xml:space="preserve">You’re </w:t>
-      </w:r>
-      <w:proofErr w:type="gramStart"/>
-      <w:r>
-        <w:t>really close</w:t>
-      </w:r>
-      <w:proofErr w:type="gramEnd"/>
-      <w:r>
-        <w:t xml:space="preserve"> to isolating the most active local 70</w:t>
+        <w:t>You’re really close to isolating the most active local 70</w:t>
       </w:r>
       <w:r>
         <w:rPr>
@@ -6282,22 +5996,10 @@
           <w:b/>
           <w:bCs/>
         </w:rPr>
-        <w:t xml:space="preserve">24 </w:t>
-      </w:r>
-      <w:proofErr w:type="gramStart"/>
-      <w:r>
-        <w:rPr>
-          <w:b/>
-          <w:bCs/>
-        </w:rPr>
-        <w:t>hours</w:t>
-      </w:r>
-      <w:r>
-        <w:t>, and</w:t>
-      </w:r>
-      <w:proofErr w:type="gramEnd"/>
-      <w:r>
-        <w:t xml:space="preserve"> automatically log activity!</w:t>
+        <w:t>24 hours</w:t>
+      </w:r>
+      <w:r>
+        <w:t>, and automatically log activity!</w:t>
       </w:r>
     </w:p>
     <w:p>
@@ -6515,21 +6217,12 @@
       </w:r>
     </w:p>
     <w:p>
-      <w:proofErr w:type="gramStart"/>
-      <w:r>
-        <w:rPr>
-          <w:b/>
-          <w:bCs/>
-        </w:rPr>
-        <w:t>Command Example</w:t>
-      </w:r>
-      <w:proofErr w:type="gramEnd"/>
-      <w:r>
-        <w:rPr>
-          <w:b/>
-          <w:bCs/>
-        </w:rPr>
-        <w:t>:</w:t>
+      <w:r>
+        <w:rPr>
+          <w:b/>
+          <w:bCs/>
+        </w:rPr>
+        <w:t>Command Example:</w:t>
       </w:r>
     </w:p>
     <w:p>
@@ -7489,15 +7182,7 @@
         <w:t>Next steps:</w:t>
       </w:r>
       <w:r>
-        <w:t xml:space="preserve"> We could also group close events together or create </w:t>
-      </w:r>
-      <w:proofErr w:type="gramStart"/>
-      <w:r>
-        <w:t>a better</w:t>
-      </w:r>
-      <w:proofErr w:type="gramEnd"/>
-      <w:r>
-        <w:t xml:space="preserve"> visualization if you want.</w:t>
+        <w:t xml:space="preserve"> We could also group close events together or create a better visualization if you want.</w:t>
       </w:r>
     </w:p>
     <w:p>
@@ -7637,46 +7322,85 @@
         <w:t xml:space="preserve">    timestamp = </w:t>
       </w:r>
       <w:proofErr w:type="spellStart"/>
-      <w:proofErr w:type="gramStart"/>
-      <w:r>
-        <w:t>datetime.datetime</w:t>
-      </w:r>
-      <w:proofErr w:type="gramEnd"/>
-      <w:r>
-        <w:t>.strptime</w:t>
+      <w:r>
+        <w:t>datetime.datetime.strptime</w:t>
       </w:r>
       <w:proofErr w:type="spellEnd"/>
       <w:r>
+        <w:t>(row[0], "%Y-%m-%</w:t>
+      </w:r>
+      <w:proofErr w:type="spellStart"/>
+      <w:r>
+        <w:t>dT%H</w:t>
+      </w:r>
+      <w:proofErr w:type="spellEnd"/>
+      <w:r>
+        <w:t>:%M:%S")</w:t>
+      </w:r>
+    </w:p>
+    <w:p>
+      <w:r>
+        <w:t xml:space="preserve">                ^^^^^^^^^^^^^^^^^^^^^^^^^^^^^^^^^^^^^^^^^^^^^^^^^^^^^^^</w:t>
+      </w:r>
+    </w:p>
+    <w:p>
+      <w:r>
+        <w:t xml:space="preserve">  File "/</w:t>
+      </w:r>
+      <w:proofErr w:type="spellStart"/>
+      <w:r>
+        <w:t>usr</w:t>
+      </w:r>
+      <w:proofErr w:type="spellEnd"/>
+      <w:r>
+        <w:t>/lib/python3.11/_strptime.py", line 568, in _</w:t>
+      </w:r>
+      <w:proofErr w:type="spellStart"/>
+      <w:r>
+        <w:t>strptime_datetime</w:t>
+      </w:r>
+      <w:proofErr w:type="spellEnd"/>
+    </w:p>
+    <w:p>
+      <w:r>
+        <w:t xml:space="preserve">    </w:t>
+      </w:r>
+      <w:proofErr w:type="spellStart"/>
+      <w:r>
+        <w:t>tt</w:t>
+      </w:r>
+      <w:proofErr w:type="spellEnd"/>
+      <w:r>
+        <w:t xml:space="preserve">, fraction, </w:t>
+      </w:r>
+      <w:proofErr w:type="spellStart"/>
+      <w:r>
+        <w:t>gmtoff_fraction</w:t>
+      </w:r>
+      <w:proofErr w:type="spellEnd"/>
+      <w:r>
+        <w:t xml:space="preserve"> = _</w:t>
+      </w:r>
+      <w:proofErr w:type="spellStart"/>
+      <w:r>
+        <w:t>strptime</w:t>
+      </w:r>
+      <w:proofErr w:type="spellEnd"/>
+      <w:r>
         <w:t>(</w:t>
       </w:r>
-      <w:proofErr w:type="gramStart"/>
-      <w:r>
-        <w:t>row[</w:t>
-      </w:r>
-      <w:proofErr w:type="gramEnd"/>
-      <w:r>
-        <w:t>0], "%Y-%m-%</w:t>
-      </w:r>
       <w:proofErr w:type="spellStart"/>
       <w:r>
-        <w:t>dT%</w:t>
-      </w:r>
-      <w:proofErr w:type="gramStart"/>
-      <w:r>
-        <w:t>H</w:t>
+        <w:t>data_string</w:t>
       </w:r>
       <w:proofErr w:type="spellEnd"/>
       <w:r>
-        <w:t>:%M:%</w:t>
-      </w:r>
-      <w:proofErr w:type="gramEnd"/>
-      <w:r>
-        <w:t>S")</w:t>
-      </w:r>
-    </w:p>
-    <w:p>
-      <w:r>
-        <w:t xml:space="preserve">                ^^^^^^^^^^^^^^^^^^^^^^^^^^^^^^^^^^^^^^^^^^^^^^^^^^^^^^^</w:t>
+        <w:t>, format)</w:t>
+      </w:r>
+    </w:p>
+    <w:p>
+      <w:r>
+        <w:t xml:space="preserve">                                    ^^^^^^^^^^^^^^^^^^^^^^^^^^^^^^</w:t>
       </w:r>
     </w:p>
     <w:p>
@@ -7689,118 +7413,43 @@
       </w:r>
       <w:proofErr w:type="spellEnd"/>
       <w:r>
-        <w:t>/lib/python3.11/_strptime.py", line 568, in _</w:t>
+        <w:t>/lib/python3.11/_strptime.py", line 349, in _</w:t>
       </w:r>
       <w:proofErr w:type="spellStart"/>
       <w:r>
-        <w:t>strptime_datetime</w:t>
+        <w:t>strptime</w:t>
       </w:r>
       <w:proofErr w:type="spellEnd"/>
     </w:p>
     <w:p>
       <w:r>
-        <w:t xml:space="preserve">    </w:t>
+        <w:t xml:space="preserve">    raise </w:t>
       </w:r>
       <w:proofErr w:type="spellStart"/>
       <w:r>
-        <w:t>tt</w:t>
+        <w:t>ValueError</w:t>
       </w:r>
       <w:proofErr w:type="spellEnd"/>
       <w:r>
-        <w:t xml:space="preserve">, fraction, </w:t>
-      </w:r>
+        <w:t>("time data %r does not match format %r" %</w:t>
+      </w:r>
+    </w:p>
+    <w:p>
       <w:proofErr w:type="spellStart"/>
       <w:r>
-        <w:t>gmtoff_fraction</w:t>
+        <w:t>ValueError</w:t>
       </w:r>
       <w:proofErr w:type="spellEnd"/>
       <w:r>
-        <w:t xml:space="preserve"> = _</w:t>
+        <w:t>: time data '2025-04-26' does not match format '%Y-%m-%</w:t>
       </w:r>
       <w:proofErr w:type="spellStart"/>
-      <w:proofErr w:type="gramStart"/>
-      <w:r>
-        <w:t>strptime</w:t>
+      <w:r>
+        <w:t>dT%H</w:t>
       </w:r>
       <w:proofErr w:type="spellEnd"/>
       <w:r>
-        <w:t>(</w:t>
-      </w:r>
-      <w:proofErr w:type="spellStart"/>
-      <w:proofErr w:type="gramEnd"/>
-      <w:r>
-        <w:t>data_string</w:t>
-      </w:r>
-      <w:proofErr w:type="spellEnd"/>
-      <w:r>
-        <w:t>, format)</w:t>
-      </w:r>
-    </w:p>
-    <w:p>
-      <w:r>
-        <w:t xml:space="preserve">                                    ^^^^^^^^^^^^^^^^^^^^^^^^^^^^^^</w:t>
-      </w:r>
-    </w:p>
-    <w:p>
-      <w:r>
-        <w:t xml:space="preserve">  File "/</w:t>
-      </w:r>
-      <w:proofErr w:type="spellStart"/>
-      <w:r>
-        <w:t>usr</w:t>
-      </w:r>
-      <w:proofErr w:type="spellEnd"/>
-      <w:r>
-        <w:t>/lib/python3.11/_strptime.py", line 349, in _</w:t>
-      </w:r>
-      <w:proofErr w:type="spellStart"/>
-      <w:r>
-        <w:t>strptime</w:t>
-      </w:r>
-      <w:proofErr w:type="spellEnd"/>
-    </w:p>
-    <w:p>
-      <w:r>
-        <w:t xml:space="preserve">    raise </w:t>
-      </w:r>
-      <w:proofErr w:type="spellStart"/>
-      <w:proofErr w:type="gramStart"/>
-      <w:r>
-        <w:t>ValueError</w:t>
-      </w:r>
-      <w:proofErr w:type="spellEnd"/>
-      <w:r>
-        <w:t>(</w:t>
-      </w:r>
-      <w:proofErr w:type="gramEnd"/>
-      <w:r>
-        <w:t>"time data %r does not match format %r" %</w:t>
-      </w:r>
-    </w:p>
-    <w:p>
-      <w:proofErr w:type="spellStart"/>
-      <w:r>
-        <w:t>ValueError</w:t>
-      </w:r>
-      <w:proofErr w:type="spellEnd"/>
-      <w:r>
-        <w:t>: time data '2025-04-26' does not match format '%Y-%m-%</w:t>
-      </w:r>
-      <w:proofErr w:type="spellStart"/>
-      <w:r>
-        <w:t>dT%</w:t>
-      </w:r>
-      <w:proofErr w:type="gramStart"/>
-      <w:r>
-        <w:t>H</w:t>
-      </w:r>
-      <w:proofErr w:type="spellEnd"/>
-      <w:r>
-        <w:t>:%M:%</w:t>
-      </w:r>
-      <w:proofErr w:type="gramEnd"/>
-      <w:r>
-        <w:t>S'</w:t>
+        <w:t>:%M:%S'</w:t>
       </w:r>
     </w:p>
     <w:p>
@@ -7846,28 +7495,12 @@
     </w:p>
     <w:p>
       <w:r>
-        <w:t xml:space="preserve">Mean + </w:t>
-      </w:r>
-      <w:proofErr w:type="gramStart"/>
-      <w:r>
-        <w:t>3?:</w:t>
-      </w:r>
-      <w:proofErr w:type="gramEnd"/>
-      <w:r>
-        <w:t xml:space="preserve"> -31.08 dBm</w:t>
-      </w:r>
-    </w:p>
-    <w:p>
-      <w:r>
-        <w:t xml:space="preserve">Mean - </w:t>
-      </w:r>
-      <w:proofErr w:type="gramStart"/>
-      <w:r>
-        <w:t>3?:</w:t>
-      </w:r>
-      <w:proofErr w:type="gramEnd"/>
-      <w:r>
-        <w:t xml:space="preserve"> -55.40 dBm</w:t>
+        <w:t>Mean + 3?: -31.08 dBm</w:t>
+      </w:r>
+    </w:p>
+    <w:p>
+      <w:r>
+        <w:t>Mean - 3?: -55.40 dBm</w:t>
       </w:r>
     </w:p>
     <w:p>
@@ -7980,25 +7613,7 @@
           <w:bCs/>
           <w:color w:val="00B050"/>
         </w:rPr>
-        <w:t xml:space="preserve">python3 </w:t>
-      </w:r>
-      <w:proofErr w:type="gramStart"/>
-      <w:r>
-        <w:rPr>
-          <w:b/>
-          <w:bCs/>
-          <w:color w:val="00B050"/>
-        </w:rPr>
-        <w:t>heatmap.py  ~</w:t>
-      </w:r>
-      <w:proofErr w:type="gramEnd"/>
-      <w:r>
-        <w:rPr>
-          <w:b/>
-          <w:bCs/>
-          <w:color w:val="00B050"/>
-        </w:rPr>
-        <w:t>/Documents/Repositories/D-Star/Frequency_Survey/Data/2025_04_26/</w:t>
+        <w:t>python3 heatmap.py  ~/Documents/Repositories/D-Star/Frequency_Survey/Data/2025_04_26/</w:t>
       </w:r>
       <w:r>
         <w:rPr>
@@ -8351,15 +7966,7 @@
     </w:p>
     <w:p>
       <w:r>
-        <w:t>"</w:t>
-      </w:r>
-      <w:proofErr w:type="gramStart"/>
-      <w:r>
-        <w:t>all</w:t>
-      </w:r>
-      <w:proofErr w:type="gramEnd"/>
-      <w:r>
-        <w:t xml:space="preserve"> x-values ≈ 446.5 MHz → I’ll write them as +4.465e2 plus a small number"</w:t>
+        <w:t>"all x-values ≈ 446.5 MHz → I’ll write them as +4.465e2 plus a small number"</w:t>
       </w:r>
     </w:p>
     <w:p>
@@ -8887,21 +8494,12 @@
         <w:t xml:space="preserve">Add </w:t>
       </w:r>
       <w:proofErr w:type="spellStart"/>
-      <w:proofErr w:type="gramStart"/>
-      <w:r>
-        <w:rPr>
-          <w:b/>
-          <w:bCs/>
-        </w:rPr>
-        <w:t>plt.ticklabel</w:t>
-      </w:r>
-      <w:proofErr w:type="gramEnd"/>
-      <w:r>
-        <w:rPr>
-          <w:b/>
-          <w:bCs/>
-        </w:rPr>
-        <w:t>_format</w:t>
+      <w:r>
+        <w:rPr>
+          <w:b/>
+          <w:bCs/>
+        </w:rPr>
+        <w:t>plt.ticklabel_format</w:t>
       </w:r>
       <w:proofErr w:type="spellEnd"/>
       <w:r>
@@ -8948,12 +8546,10 @@
         <w:t xml:space="preserve">import </w:t>
       </w:r>
       <w:proofErr w:type="spellStart"/>
-      <w:proofErr w:type="gramStart"/>
       <w:r>
         <w:t>matplotlib.ticker</w:t>
       </w:r>
       <w:proofErr w:type="spellEnd"/>
-      <w:proofErr w:type="gramEnd"/>
       <w:r>
         <w:t xml:space="preserve"> as ticker</w:t>
       </w:r>
@@ -8961,23 +8557,7 @@
     <w:p/>
     <w:p>
       <w:r>
-        <w:t>plt.gca(</w:t>
-      </w:r>
-      <w:proofErr w:type="gramStart"/>
-      <w:r>
-        <w:t>).xaxis.set</w:t>
-      </w:r>
-      <w:proofErr w:type="gramEnd"/>
-      <w:r>
-        <w:t>_major_formatter(</w:t>
-      </w:r>
-      <w:proofErr w:type="gramStart"/>
-      <w:r>
-        <w:t>ticker.ScalarFormatter</w:t>
-      </w:r>
-      <w:proofErr w:type="gramEnd"/>
-      <w:r>
-        <w:t>(useOffset=False))</w:t>
+        <w:t>plt.gca().xaxis.set_major_formatter(ticker.ScalarFormatter(useOffset=False))</w:t>
       </w:r>
     </w:p>
     <w:p>
@@ -8987,25 +8567,12 @@
     </w:p>
     <w:p>
       <w:proofErr w:type="spellStart"/>
-      <w:proofErr w:type="gramStart"/>
-      <w:r>
-        <w:t>plt.ticklabel</w:t>
-      </w:r>
-      <w:proofErr w:type="gramEnd"/>
-      <w:r>
-        <w:t>_</w:t>
-      </w:r>
-      <w:proofErr w:type="gramStart"/>
-      <w:r>
-        <w:t>format</w:t>
+      <w:r>
+        <w:t>plt.ticklabel_format</w:t>
       </w:r>
       <w:proofErr w:type="spellEnd"/>
       <w:r>
-        <w:t>(</w:t>
-      </w:r>
-      <w:proofErr w:type="gramEnd"/>
-      <w:r>
-        <w:t>style='plain', axis='x')</w:t>
+        <w:t>(style='plain', axis='x')</w:t>
       </w:r>
     </w:p>
     <w:p>
@@ -9131,12 +8698,10 @@
         <w:t xml:space="preserve">import </w:t>
       </w:r>
       <w:proofErr w:type="spellStart"/>
-      <w:proofErr w:type="gramStart"/>
       <w:r>
         <w:t>matplotlib.pyplot</w:t>
       </w:r>
       <w:proofErr w:type="spellEnd"/>
-      <w:proofErr w:type="gramEnd"/>
       <w:r>
         <w:t xml:space="preserve"> as </w:t>
       </w:r>
@@ -9156,12 +8721,10 @@
         <w:t xml:space="preserve">import </w:t>
       </w:r>
       <w:proofErr w:type="spellStart"/>
-      <w:proofErr w:type="gramStart"/>
       <w:r>
         <w:t>matplotlib.ticker</w:t>
       </w:r>
       <w:proofErr w:type="spellEnd"/>
-      <w:proofErr w:type="gramEnd"/>
       <w:r>
         <w:t xml:space="preserve"> as ticker</w:t>
       </w:r>
@@ -9182,319 +8745,210 @@
         <w:t xml:space="preserve"> = </w:t>
       </w:r>
       <w:proofErr w:type="spellStart"/>
-      <w:proofErr w:type="gramStart"/>
-      <w:r>
-        <w:t>pd.read</w:t>
-      </w:r>
-      <w:proofErr w:type="gramEnd"/>
-      <w:r>
-        <w:t>_</w:t>
-      </w:r>
-      <w:proofErr w:type="gramStart"/>
-      <w:r>
-        <w:t>csv</w:t>
+      <w:r>
+        <w:t>pd.read_csv</w:t>
       </w:r>
       <w:proofErr w:type="spellEnd"/>
       <w:r>
+        <w:t>('strong_cluster_freqs.csv', header=None)[0]</w:t>
+      </w:r>
+    </w:p>
+    <w:p>
+      <w:proofErr w:type="spellStart"/>
+      <w:r>
+        <w:t>weak_freqs</w:t>
+      </w:r>
+      <w:proofErr w:type="spellEnd"/>
+      <w:r>
+        <w:t xml:space="preserve"> = </w:t>
+      </w:r>
+      <w:proofErr w:type="spellStart"/>
+      <w:r>
+        <w:t>pd.read_csv</w:t>
+      </w:r>
+      <w:proofErr w:type="spellEnd"/>
+      <w:r>
+        <w:t>('weak_cluster_freqs.csv', header=None)[0]</w:t>
+      </w:r>
+    </w:p>
+    <w:p/>
+    <w:p>
+      <w:proofErr w:type="spellStart"/>
+      <w:r>
+        <w:t>plt.figure</w:t>
+      </w:r>
+      <w:proofErr w:type="spellEnd"/>
+      <w:r>
         <w:t>(</w:t>
       </w:r>
-      <w:proofErr w:type="gramEnd"/>
-      <w:r>
-        <w:t>'strong_cluster_freqs.csv', header=</w:t>
-      </w:r>
-      <w:proofErr w:type="gramStart"/>
-      <w:r>
-        <w:t>None)[</w:t>
-      </w:r>
-      <w:proofErr w:type="gramEnd"/>
-      <w:r>
-        <w:t>0]</w:t>
-      </w:r>
-    </w:p>
-    <w:p>
       <w:proofErr w:type="spellStart"/>
       <w:r>
+        <w:t>figsize</w:t>
+      </w:r>
+      <w:proofErr w:type="spellEnd"/>
+      <w:r>
+        <w:t>=(12, 6))</w:t>
+      </w:r>
+    </w:p>
+    <w:p/>
+    <w:p>
+      <w:r>
+        <w:t># Plot histograms</w:t>
+      </w:r>
+    </w:p>
+    <w:p>
+      <w:proofErr w:type="spellStart"/>
+      <w:r>
+        <w:t>plt.hist</w:t>
+      </w:r>
+      <w:proofErr w:type="spellEnd"/>
+      <w:r>
+        <w:t>(</w:t>
+      </w:r>
+      <w:proofErr w:type="spellStart"/>
+      <w:r>
+        <w:t>strong_freqs</w:t>
+      </w:r>
+      <w:proofErr w:type="spellEnd"/>
+      <w:r>
+        <w:t>, bins=100, color='</w:t>
+      </w:r>
+      <w:proofErr w:type="spellStart"/>
+      <w:r>
+        <w:t>steelblue</w:t>
+      </w:r>
+      <w:proofErr w:type="spellEnd"/>
+      <w:r>
+        <w:t>', alpha=0.7, label='Strong signals (-42 dBm and above)')</w:t>
+      </w:r>
+    </w:p>
+    <w:p>
+      <w:proofErr w:type="spellStart"/>
+      <w:r>
+        <w:t>plt.hist</w:t>
+      </w:r>
+      <w:proofErr w:type="spellEnd"/>
+      <w:r>
+        <w:t>(</w:t>
+      </w:r>
+      <w:proofErr w:type="spellStart"/>
+      <w:r>
         <w:t>weak_freqs</w:t>
       </w:r>
       <w:proofErr w:type="spellEnd"/>
       <w:r>
-        <w:t xml:space="preserve"> = </w:t>
-      </w:r>
+        <w:t>, bins=100, color='orange', alpha=0.5, label='Weaker signals (-49 to -44 dBm)')</w:t>
+      </w:r>
+    </w:p>
+    <w:p/>
+    <w:p>
       <w:proofErr w:type="spellStart"/>
-      <w:proofErr w:type="gramStart"/>
-      <w:r>
-        <w:t>pd.read</w:t>
-      </w:r>
-      <w:proofErr w:type="gramEnd"/>
-      <w:r>
-        <w:t>_</w:t>
-      </w:r>
-      <w:proofErr w:type="gramStart"/>
-      <w:r>
-        <w:t>csv</w:t>
+      <w:r>
+        <w:t>plt.xlabel</w:t>
       </w:r>
       <w:proofErr w:type="spellEnd"/>
       <w:r>
-        <w:t>(</w:t>
-      </w:r>
-      <w:proofErr w:type="gramEnd"/>
-      <w:r>
-        <w:t>'weak_cluster_freqs.csv', header=</w:t>
-      </w:r>
-      <w:proofErr w:type="gramStart"/>
-      <w:r>
-        <w:t>None)[</w:t>
-      </w:r>
-      <w:proofErr w:type="gramEnd"/>
-      <w:r>
-        <w:t>0]</w:t>
+        <w:t>('Frequency (MHz)')</w:t>
+      </w:r>
+    </w:p>
+    <w:p>
+      <w:proofErr w:type="spellStart"/>
+      <w:r>
+        <w:t>plt.ylabel</w:t>
+      </w:r>
+      <w:proofErr w:type="spellEnd"/>
+      <w:r>
+        <w:t>('Count')</w:t>
+      </w:r>
+    </w:p>
+    <w:p>
+      <w:proofErr w:type="spellStart"/>
+      <w:r>
+        <w:t>plt.title</w:t>
+      </w:r>
+      <w:proofErr w:type="spellEnd"/>
+      <w:r>
+        <w:t>('Frequencies of Detected Signal Clusters')</w:t>
       </w:r>
     </w:p>
     <w:p/>
     <w:p>
+      <w:r>
+        <w:t xml:space="preserve"># </w:t>
+      </w:r>
+      <w:r>
+        <w:rPr>
+          <w:rFonts w:ascii="Segoe UI Emoji" w:hAnsi="Segoe UI Emoji" w:cs="Segoe UI Emoji"/>
+        </w:rPr>
+        <w:t>✅</w:t>
+      </w:r>
+      <w:r>
+        <w:t xml:space="preserve"> Disable scientific notation &amp; offset</w:t>
+      </w:r>
+    </w:p>
+    <w:p>
       <w:proofErr w:type="spellStart"/>
-      <w:proofErr w:type="gramStart"/>
-      <w:r>
-        <w:t>plt.figure</w:t>
+      <w:r>
+        <w:t>plt.ticklabel_format</w:t>
       </w:r>
       <w:proofErr w:type="spellEnd"/>
-      <w:proofErr w:type="gramEnd"/>
-      <w:r>
-        <w:t>(</w:t>
-      </w:r>
+      <w:r>
+        <w:t>(style='plain', axis='x')</w:t>
+      </w:r>
+    </w:p>
+    <w:p>
+      <w:r>
+        <w:t>plt.gca().xaxis.set_major_formatter(ticker.ScalarFormatter(useOffset=False))</w:t>
+      </w:r>
+    </w:p>
+    <w:p/>
+    <w:p>
       <w:proofErr w:type="spellStart"/>
       <w:r>
-        <w:t>figsize</w:t>
+        <w:t>plt.legend</w:t>
       </w:r>
       <w:proofErr w:type="spellEnd"/>
-      <w:proofErr w:type="gramStart"/>
-      <w:r>
-        <w:t>=(</w:t>
-      </w:r>
-      <w:proofErr w:type="gramEnd"/>
-      <w:r>
-        <w:t>12, 6))</w:t>
+      <w:r>
+        <w:t>()</w:t>
+      </w:r>
+    </w:p>
+    <w:p>
+      <w:proofErr w:type="spellStart"/>
+      <w:r>
+        <w:t>plt.grid</w:t>
+      </w:r>
+      <w:proofErr w:type="spellEnd"/>
+      <w:r>
+        <w:t>(True)</w:t>
       </w:r>
     </w:p>
     <w:p/>
     <w:p>
-      <w:r>
-        <w:t># Plot histograms</w:t>
-      </w:r>
-    </w:p>
-    <w:p>
       <w:proofErr w:type="spellStart"/>
-      <w:proofErr w:type="gramStart"/>
-      <w:r>
-        <w:t>plt.hist</w:t>
+      <w:r>
+        <w:t>plt.tight_layout</w:t>
       </w:r>
       <w:proofErr w:type="spellEnd"/>
-      <w:proofErr w:type="gramEnd"/>
-      <w:r>
-        <w:t>(</w:t>
-      </w:r>
+      <w:r>
+        <w:t>()</w:t>
+      </w:r>
+    </w:p>
+    <w:p>
       <w:proofErr w:type="spellStart"/>
       <w:r>
-        <w:t>strong_freqs</w:t>
+        <w:t>plt.savefig</w:t>
       </w:r>
       <w:proofErr w:type="spellEnd"/>
       <w:r>
-        <w:t>, bins=100, color='</w:t>
-      </w:r>
+        <w:t>('frequency_clusters_histogram_cleaned.png')</w:t>
+      </w:r>
+    </w:p>
+    <w:p>
       <w:proofErr w:type="spellStart"/>
       <w:r>
-        <w:t>steelblue</w:t>
+        <w:t>plt.show</w:t>
       </w:r>
       <w:proofErr w:type="spellEnd"/>
-      <w:r>
-        <w:t>', alpha=0.7, label='Strong signals (-42 dBm and above)')</w:t>
-      </w:r>
-    </w:p>
-    <w:p>
-      <w:proofErr w:type="spellStart"/>
-      <w:proofErr w:type="gramStart"/>
-      <w:r>
-        <w:t>plt.hist</w:t>
-      </w:r>
-      <w:proofErr w:type="spellEnd"/>
-      <w:proofErr w:type="gramEnd"/>
-      <w:r>
-        <w:t>(</w:t>
-      </w:r>
-      <w:proofErr w:type="spellStart"/>
-      <w:r>
-        <w:t>weak_freqs</w:t>
-      </w:r>
-      <w:proofErr w:type="spellEnd"/>
-      <w:r>
-        <w:t>, bins=100, color='orange', alpha=0.5, label='Weaker signals (-49 to -44 dBm)')</w:t>
-      </w:r>
-    </w:p>
-    <w:p/>
-    <w:p>
-      <w:proofErr w:type="spellStart"/>
-      <w:proofErr w:type="gramStart"/>
-      <w:r>
-        <w:t>plt.xlabel</w:t>
-      </w:r>
-      <w:proofErr w:type="spellEnd"/>
-      <w:proofErr w:type="gramEnd"/>
-      <w:r>
-        <w:t>('Frequency (MHz)')</w:t>
-      </w:r>
-    </w:p>
-    <w:p>
-      <w:proofErr w:type="spellStart"/>
-      <w:proofErr w:type="gramStart"/>
-      <w:r>
-        <w:t>plt.ylabel</w:t>
-      </w:r>
-      <w:proofErr w:type="spellEnd"/>
-      <w:proofErr w:type="gramEnd"/>
-      <w:r>
-        <w:t>('Count')</w:t>
-      </w:r>
-    </w:p>
-    <w:p>
-      <w:proofErr w:type="spellStart"/>
-      <w:proofErr w:type="gramStart"/>
-      <w:r>
-        <w:t>plt.title</w:t>
-      </w:r>
-      <w:proofErr w:type="spellEnd"/>
-      <w:proofErr w:type="gramEnd"/>
-      <w:r>
-        <w:t>('Frequencies of Detected Signal Clusters')</w:t>
-      </w:r>
-    </w:p>
-    <w:p/>
-    <w:p>
-      <w:r>
-        <w:t xml:space="preserve"># </w:t>
-      </w:r>
-      <w:r>
-        <w:rPr>
-          <w:rFonts w:ascii="Segoe UI Emoji" w:hAnsi="Segoe UI Emoji" w:cs="Segoe UI Emoji"/>
-        </w:rPr>
-        <w:t>✅</w:t>
-      </w:r>
-      <w:r>
-        <w:t xml:space="preserve"> Disable scientific notation &amp; offset</w:t>
-      </w:r>
-    </w:p>
-    <w:p>
-      <w:proofErr w:type="spellStart"/>
-      <w:proofErr w:type="gramStart"/>
-      <w:r>
-        <w:t>plt.ticklabel</w:t>
-      </w:r>
-      <w:proofErr w:type="gramEnd"/>
-      <w:r>
-        <w:t>_</w:t>
-      </w:r>
-      <w:proofErr w:type="gramStart"/>
-      <w:r>
-        <w:t>format</w:t>
-      </w:r>
-      <w:proofErr w:type="spellEnd"/>
-      <w:r>
-        <w:t>(</w:t>
-      </w:r>
-      <w:proofErr w:type="gramEnd"/>
-      <w:r>
-        <w:t>style='plain', axis='x')</w:t>
-      </w:r>
-    </w:p>
-    <w:p>
-      <w:r>
-        <w:t>plt.gca(</w:t>
-      </w:r>
-      <w:proofErr w:type="gramStart"/>
-      <w:r>
-        <w:t>).xaxis.set</w:t>
-      </w:r>
-      <w:proofErr w:type="gramEnd"/>
-      <w:r>
-        <w:t>_major_formatter(</w:t>
-      </w:r>
-      <w:proofErr w:type="gramStart"/>
-      <w:r>
-        <w:t>ticker.ScalarFormatter</w:t>
-      </w:r>
-      <w:proofErr w:type="gramEnd"/>
-      <w:r>
-        <w:t>(useOffset=False))</w:t>
-      </w:r>
-    </w:p>
-    <w:p/>
-    <w:p>
-      <w:proofErr w:type="spellStart"/>
-      <w:proofErr w:type="gramStart"/>
-      <w:r>
-        <w:t>plt.legend</w:t>
-      </w:r>
-      <w:proofErr w:type="spellEnd"/>
-      <w:proofErr w:type="gramEnd"/>
-      <w:r>
-        <w:t>()</w:t>
-      </w:r>
-    </w:p>
-    <w:p>
-      <w:proofErr w:type="spellStart"/>
-      <w:proofErr w:type="gramStart"/>
-      <w:r>
-        <w:t>plt.grid</w:t>
-      </w:r>
-      <w:proofErr w:type="spellEnd"/>
-      <w:proofErr w:type="gramEnd"/>
-      <w:r>
-        <w:t>(True)</w:t>
-      </w:r>
-    </w:p>
-    <w:p/>
-    <w:p>
-      <w:proofErr w:type="spellStart"/>
-      <w:proofErr w:type="gramStart"/>
-      <w:r>
-        <w:t>plt.tight</w:t>
-      </w:r>
-      <w:proofErr w:type="gramEnd"/>
-      <w:r>
-        <w:t>_</w:t>
-      </w:r>
-      <w:proofErr w:type="gramStart"/>
-      <w:r>
-        <w:t>layout</w:t>
-      </w:r>
-      <w:proofErr w:type="spellEnd"/>
-      <w:r>
-        <w:t>(</w:t>
-      </w:r>
-      <w:proofErr w:type="gramEnd"/>
-      <w:r>
-        <w:t>)</w:t>
-      </w:r>
-    </w:p>
-    <w:p>
-      <w:proofErr w:type="spellStart"/>
-      <w:proofErr w:type="gramStart"/>
-      <w:r>
-        <w:t>plt.savefig</w:t>
-      </w:r>
-      <w:proofErr w:type="spellEnd"/>
-      <w:proofErr w:type="gramEnd"/>
-      <w:r>
-        <w:t>('frequency_clusters_histogram_cleaned.png')</w:t>
-      </w:r>
-    </w:p>
-    <w:p>
-      <w:proofErr w:type="spellStart"/>
-      <w:proofErr w:type="gramStart"/>
-      <w:r>
-        <w:t>plt.show</w:t>
-      </w:r>
-      <w:proofErr w:type="spellEnd"/>
-      <w:proofErr w:type="gramEnd"/>
       <w:r>
         <w:t>()</w:t>
       </w:r>
@@ -9522,6 +8976,9 @@
     <w:p/>
     <w:p>
       <w:r>
+        <w:rPr>
+          <w:noProof/>
+        </w:rPr>
         <w:drawing>
           <wp:inline distT="0" distB="0" distL="0" distR="0" wp14:anchorId="31A4E86F" wp14:editId="278EA5CD">
             <wp:extent cx="5943600" cy="2883535"/>
@@ -9591,7 +9048,7 @@
       <w:r>
         <w:lastRenderedPageBreak/>
         <w:pict w14:anchorId="02EDFF3E">
-          <v:rect id="_x0000_i1061" style="width:0;height:1.5pt" o:hralign="center" o:hrstd="t" o:hr="t" fillcolor="#a0a0a0" stroked="f"/>
+          <v:rect id="_x0000_i1049" style="width:0;height:1.5pt" o:hralign="center" o:hrstd="t" o:hr="t" fillcolor="#a0a0a0" stroked="f"/>
         </w:pict>
       </w:r>
     </w:p>
@@ -9848,23 +9305,7 @@
           <w:b/>
           <w:bCs/>
         </w:rPr>
-        <w:t xml:space="preserve">No significant signal activity </w:t>
-      </w:r>
-      <w:proofErr w:type="gramStart"/>
-      <w:r>
-        <w:rPr>
-          <w:b/>
-          <w:bCs/>
-        </w:rPr>
-        <w:t>detected</w:t>
-      </w:r>
-      <w:proofErr w:type="gramEnd"/>
-      <w:r>
-        <w:rPr>
-          <w:b/>
-          <w:bCs/>
-        </w:rPr>
-        <w:t xml:space="preserve"> at 446.500 </w:t>
+        <w:t xml:space="preserve">No significant signal activity detected at 446.500 </w:t>
       </w:r>
       <w:proofErr w:type="spellStart"/>
       <w:r>
@@ -10142,7 +9583,7 @@
     <w:p>
       <w:r>
         <w:pict w14:anchorId="7F6596F5">
-          <v:rect id="_x0000_i1062" style="width:0;height:1.5pt" o:hralign="center" o:hrstd="t" o:hr="t" fillcolor="#a0a0a0" stroked="f"/>
+          <v:rect id="_x0000_i1050" style="width:0;height:1.5pt" o:hralign="center" o:hrstd="t" o:hr="t" fillcolor="#a0a0a0" stroked="f"/>
         </w:pict>
       </w:r>
     </w:p>
@@ -14573,6 +14014,7 @@
   <w:style w:type="character" w:default="1" w:styleId="DefaultParagraphFont">
     <w:name w:val="Default Paragraph Font"/>
     <w:uiPriority w:val="1"/>
+    <w:semiHidden/>
     <w:unhideWhenUsed/>
   </w:style>
   <w:style w:type="table" w:default="1" w:styleId="TableNormal">

</xml_diff>